<commit_message>
Update working paper and presentation with correct author name and DOI
</commit_message>
<xml_diff>
--- a/docs/Urban_GDP_NTL_Working_Paper.docx
+++ b/docs/Urban_GDP_NTL_Working_Paper.docx
@@ -55,7 +55,14 @@
           <w:color w:val="1E293B"/>
           <w:lang w:val="en-GB"/>
         </w:rPr>
-        <w:t>George Ogutu</w:t>
+        <w:t xml:space="preserve">George Ogutu, </w:t>
+      </w:r>
+      <w:r>
+        <w:rPr>
+          <w:color w:val="1E293B"/>
+          <w:lang w:val="en-GB"/>
+        </w:rPr>
+        <w:t>University of Nairobi, Department of Earth and Climate Sciences</w:t>
       </w:r>
     </w:p>
     <w:p>
@@ -88,58 +95,182 @@
     </w:p>
     <w:p>
       <w:pPr>
-        <w:pBdr>
-          <w:left w:val="single" w:sz="12" w:space="8" w:color="0E7C7B"/>
-        </w:pBdr>
-        <w:shd w:val="clear" w:color="auto" w:fill="EEF2FF"/>
-        <w:spacing w:after="12"/>
+        <w:pStyle w:val="Heading1"/>
+        <w:spacing w:after="120"/>
         <w:rPr>
           <w:lang w:val="en-GB"/>
         </w:rPr>
       </w:pPr>
       <w:r>
         <w:rPr>
-          <w:b/>
-          <w:bCs/>
-          <w:color w:val="0E7C7B"/>
-          <w:lang w:val="en-GB"/>
-        </w:rPr>
-        <w:t xml:space="preserve">Audience: </w:t>
-      </w:r>
-      <w:r>
-        <w:rPr>
-          <w:color w:val="1E293B"/>
-          <w:lang w:val="en-GB"/>
-        </w:rPr>
-        <w:t>UN-Habitat Data &amp; Analytics Team</w:t>
+          <w:lang w:val="en-GB"/>
+        </w:rPr>
+        <w:t>1. Executive Summary</w:t>
       </w:r>
     </w:p>
     <w:p>
       <w:pPr>
-        <w:pBdr>
-          <w:left w:val="single" w:sz="12" w:space="8" w:color="0E7C7B"/>
-        </w:pBdr>
-        <w:shd w:val="clear" w:color="auto" w:fill="EEF2FF"/>
-        <w:spacing w:after="200"/>
+        <w:spacing w:after="160"/>
+        <w:jc w:val="both"/>
         <w:rPr>
           <w:lang w:val="en-GB"/>
         </w:rPr>
       </w:pPr>
+      <w:r>
+        <w:rPr>
+          <w:color w:val="1E293B"/>
+          <w:lang w:val="en-GB"/>
+        </w:rPr>
+        <w:t xml:space="preserve">This working paper presents a global analysis </w:t>
+      </w:r>
+      <w:r>
+        <w:rPr>
+          <w:color w:val="1E293B"/>
+          <w:lang w:val="en-GB"/>
+        </w:rPr>
+        <w:t>that estimates the share of urban centres in national GDP for 170 countries and 12,818 cities,</w:t>
+      </w:r>
+      <w:r>
+        <w:rPr>
+          <w:color w:val="1E293B"/>
+          <w:lang w:val="en-GB"/>
+        </w:rPr>
+        <w:t xml:space="preserve"> using satellite-derived nighttime lights (NTL), gridded population data, and open geospatial datasets. The analysis addresses a critical data gap: more than 60% of countries worldwide lack published subnational GDP statistics, </w:t>
+      </w:r>
+      <w:r>
+        <w:rPr>
+          <w:color w:val="1E293B"/>
+          <w:lang w:val="en-GB"/>
+        </w:rPr>
+        <w:t>leaving city-level economic monitoring dependent on infrequent,</w:t>
+      </w:r>
+      <w:r>
+        <w:rPr>
+          <w:color w:val="1E293B"/>
+          <w:lang w:val="en-GB"/>
+        </w:rPr>
+        <w:t xml:space="preserve"> resource-intensive census cycles.</w:t>
+      </w:r>
+    </w:p>
+    <w:p>
+      <w:pPr>
+        <w:spacing w:after="160"/>
+        <w:jc w:val="both"/>
+        <w:rPr>
+          <w:lang w:val="en-GB"/>
+        </w:rPr>
+      </w:pPr>
+      <w:r>
+        <w:rPr>
+          <w:color w:val="1E293B"/>
+          <w:lang w:val="en-GB"/>
+        </w:rPr>
+        <w:t>The methodology employs a Random Forest regression model trained against observed city-level GDP figures from the GHS Urban Centre Database (GHS-UCDB R2019A). The model uses 20 features per city, including VIIRS DNB nighttime radiance, built-up area growth, population density, and country-level encodings. A five-fold cross-validation yields an R² of 0.789, with an in-sample R² of 0.883 and a residual standard deviation of 0.040 on the log-GDP scale. Predicted city-level scores are proportionally scaled so that national sums equal World Bank official GDP figures for 2020, ensuring macro-level consistency.</w:t>
+      </w:r>
+    </w:p>
+    <w:p>
+      <w:pPr>
+        <w:spacing w:after="160"/>
+        <w:jc w:val="both"/>
+        <w:rPr>
+          <w:lang w:val="en-GB"/>
+        </w:rPr>
+      </w:pPr>
+      <w:r>
+        <w:rPr>
+          <w:color w:val="1E293B"/>
+          <w:lang w:val="en-GB"/>
+        </w:rPr>
+        <w:t xml:space="preserve">The principal findings indicate a global mean urban GDP share of </w:t>
+      </w:r>
       <w:r>
         <w:rPr>
           <w:b/>
           <w:bCs/>
-          <w:color w:val="0E7C7B"/>
-          <w:lang w:val="en-GB"/>
-        </w:rPr>
-        <w:t xml:space="preserve">Status: </w:t>
-      </w:r>
-      <w:r>
-        <w:rPr>
           <w:color w:val="1E293B"/>
           <w:lang w:val="en-GB"/>
         </w:rPr>
-        <w:t>Working Paper — Internal Review Draft</w:t>
+        <w:t>56.7%</w:t>
+      </w:r>
+      <w:r>
+        <w:rPr>
+          <w:color w:val="1E293B"/>
+          <w:lang w:val="en-GB"/>
+        </w:rPr>
+        <w:t xml:space="preserve"> (median 56.4%), with an estimated global urban GDP of </w:t>
+      </w:r>
+      <w:r>
+        <w:rPr>
+          <w:b/>
+          <w:bCs/>
+          <w:color w:val="1E293B"/>
+          <w:lang w:val="en-GB"/>
+        </w:rPr>
+        <w:t>USD 39.2 trillion</w:t>
+      </w:r>
+      <w:r>
+        <w:rPr>
+          <w:color w:val="1E293B"/>
+          <w:lang w:val="en-GB"/>
+        </w:rPr>
+        <w:t xml:space="preserve"> in 2020. Regional urban shares range from 75.6% in Asia to 31.7% in Europe, reflecting fundamental differences in urban economic concentration. Tokyo (USD 757 billion), Osaka (USD 672 billion), and Seoul (USD 577 billion) are the top three cities by estimated GDP. Kenya's urban share of 47.5%, with Nairobi contributing 29.5% of </w:t>
+      </w:r>
+      <w:r>
+        <w:rPr>
+          <w:color w:val="1E293B"/>
+          <w:lang w:val="en-GB"/>
+        </w:rPr>
+        <w:t xml:space="preserve">the national GDP, is below the African continental </w:t>
+      </w:r>
+      <w:r>
+        <w:rPr>
+          <w:color w:val="1E293B"/>
+          <w:lang w:val="en-GB"/>
+        </w:rPr>
+        <w:t>mean of 53.5%.</w:t>
+      </w:r>
+    </w:p>
+    <w:p>
+      <w:pPr>
+        <w:spacing w:after="160"/>
+        <w:jc w:val="both"/>
+        <w:rPr>
+          <w:lang w:val="en-GB"/>
+        </w:rPr>
+      </w:pPr>
+      <w:r>
+        <w:rPr>
+          <w:color w:val="1E293B"/>
+          <w:lang w:val="en-GB"/>
+        </w:rPr>
+        <w:t xml:space="preserve">These results have direct relevance for SDG 11.a.1 monitoring, disaster risk finance, and cross-country benchmarking in the absence of official subnational economic statistics. The full Python pipeline is open-source, </w:t>
+      </w:r>
+      <w:r>
+        <w:rPr>
+          <w:color w:val="1E293B"/>
+          <w:lang w:val="en-GB"/>
+        </w:rPr>
+        <w:t>can be updated annually with new VIIRS composites, and requires no census data to apply</w:t>
+      </w:r>
+      <w:r>
+        <w:rPr>
+          <w:color w:val="1E293B"/>
+          <w:lang w:val="en-GB"/>
+        </w:rPr>
+        <w:t xml:space="preserve"> to any country.</w:t>
+      </w:r>
+    </w:p>
+    <w:p>
+      <w:pPr>
+        <w:rPr>
+          <w:lang w:val="en-GB"/>
+        </w:rPr>
+      </w:pPr>
+      <w:r>
+        <w:rPr>
+          <w:lang w:val="en-GB"/>
+        </w:rPr>
+        <w:br w:type="page"/>
       </w:r>
     </w:p>
     <w:p>
@@ -154,7 +285,8 @@
         <w:rPr>
           <w:lang w:val="en-GB"/>
         </w:rPr>
-        <w:t xml:space="preserve"> Executive Summary</w:t>
+        <w:lastRenderedPageBreak/>
+        <w:t>2. Introduction &amp; Background</w:t>
       </w:r>
     </w:p>
     <w:p>
@@ -162,16 +294,29 @@
         <w:spacing w:after="160"/>
         <w:jc w:val="both"/>
         <w:rPr>
+          <w:lang w:val="en-GB"/>
+        </w:rPr>
+      </w:pPr>
+      <w:r>
+        <w:rPr>
           <w:color w:val="1E293B"/>
           <w:lang w:val="en-GB"/>
         </w:rPr>
-      </w:pPr>
+        <w:t xml:space="preserve">Cities are the primary engines of the global economy. UN-Habitat (2020) estimates that urban areas generate between 60% and 80% of global GDP while occupying less than 3% of the Earth's land surface. This concentration of economic activity in relatively small geographic areas makes </w:t>
+      </w:r>
       <w:r>
         <w:rPr>
           <w:color w:val="1E293B"/>
           <w:lang w:val="en-GB"/>
         </w:rPr>
-        <w:t>This working paper presents a global analysis estimating the share of national GDP attributable to urban centres across 170 countries and 12,818 cities, using satellite-derived nighttime lights (NTL), gridded population data, and open geospatial datasets. The analysis addresses a critical data gap: more than 60% of countries worldwide lack published subnational GDP statistics, leaving city-level economic monitoring reliant on infrequent and resource-intensive census cycles.</w:t>
+        <w:t xml:space="preserve">the share of urban GDP </w:t>
+      </w:r>
+      <w:r>
+        <w:rPr>
+          <w:color w:val="1E293B"/>
+          <w:lang w:val="en-GB"/>
+        </w:rPr>
+        <w:t>a fundamental metric for sustainable development planning, infrastructure investment allocation, and disaster risk assessment. It is directly relevant to SDG 11, which calls for inclusive, safe, resilient, and sustainable cities, and to its indicator 11.a.1, which monitors national urban policies and regional development planning.</w:t>
       </w:r>
     </w:p>
     <w:p>
@@ -179,16 +324,29 @@
         <w:spacing w:after="160"/>
         <w:jc w:val="both"/>
         <w:rPr>
+          <w:lang w:val="en-GB"/>
+        </w:rPr>
+      </w:pPr>
+      <w:r>
+        <w:rPr>
           <w:color w:val="1E293B"/>
           <w:lang w:val="en-GB"/>
         </w:rPr>
-      </w:pPr>
+        <w:t xml:space="preserve">Despite this </w:t>
+      </w:r>
       <w:r>
         <w:rPr>
           <w:color w:val="1E293B"/>
           <w:lang w:val="en-GB"/>
         </w:rPr>
-        <w:t>The methodology employs a Random Forest regression model trained on observed city-level GDP figures from the GHS Urban Centre Database (GHS-UCDB R2019A). The model uses 20 features per city, including VIIRS DNB nighttime radiance, built-up area growth, population density, and country-level encodings. Five-fold cross-validation yields an R² of 0.789, with an in-sample R² of 0.883 and a residual standard deviation of 0.040 on the log-GDP scale. Predicted city-level scores are scaled so that national sums match World Bank official GDP figures for 2020, ensuring macro-level consistency.</w:t>
+        <w:t>recognised</w:t>
+      </w:r>
+      <w:r>
+        <w:rPr>
+          <w:color w:val="1E293B"/>
+          <w:lang w:val="en-GB"/>
+        </w:rPr>
+        <w:t xml:space="preserve"> importance, a persistent data gap hinders city-level economic monitoring in much of the world. Official subnational GDP statistics — published by national statistical offices at the city, province, or state level — are available for fewer than 40% of countries. In Sub-Saharan Africa and parts of South and Southeast Asia, city-level economic data are either absent or available only at multi-year intervals through costly household surveys and census operations. This gap makes it impossible to track urban economic dynamics in real time or to conduct meaningful cross-country comparisons of city economic performance.</w:t>
       </w:r>
     </w:p>
     <w:p>
@@ -196,16 +354,15 @@
         <w:spacing w:after="160"/>
         <w:jc w:val="both"/>
         <w:rPr>
+          <w:lang w:val="en-GB"/>
+        </w:rPr>
+      </w:pPr>
+      <w:r>
+        <w:rPr>
           <w:color w:val="1E293B"/>
           <w:lang w:val="en-GB"/>
         </w:rPr>
-      </w:pPr>
-      <w:r>
-        <w:rPr>
-          <w:color w:val="1E293B"/>
-          <w:lang w:val="en-GB"/>
-        </w:rPr>
-        <w:t>The principal findings indicate a global mean urban GDP share of 56.7% (median 56.4%), with an estimated global urban GDP of USD 39.2 trillion in 2020. Regional urban shares range from 75.6% in Asia to 31.7% in Europe, reflecting fundamental differences in urban economic concentration. Tokyo (USD 757 billion), Osaka (USD 672 billion), and Seoul (USD 577 billion) are the top three cities by estimated GDP. Kenya's urban share of 47.5%, with Nairobi contributing 29.5% of national GDP, is below the continental African mean of 53.5%.</w:t>
+        <w:t>Nighttime satellite imagery offers a compelling alternative. Seminal work by Henderson, Storeygard, and Weil (2012) demonstrated that the logarithmic change in nighttime lights is a reliable proxy for GDP growth, explaining approximately 0.73 of the variance in regional income growth across a global sample. Ghosh et al. (2010) showed that DMSP-OLS nighttime lights could predict regional GDP within the United States with R² values above 0.85. More recently, Zhang et al. (2024) produced a harmonized global NTL time series from 1992 to 2023 using simulated VIIRS data, enabling long-term urban economic trend analysis.</w:t>
       </w:r>
     </w:p>
     <w:p>
@@ -221,22 +378,40 @@
           <w:color w:val="1E293B"/>
           <w:lang w:val="en-GB"/>
         </w:rPr>
-        <w:t>These results are directly relevant to SDG 11.a.1 monitoring, disaster risk finance, and cross-country benchmarking in the absence of official subnational economic statistics. The full Python pipeline is open-source, annually updatable using new VIIRS composites, and requires no census data for application to any country.</w:t>
+        <w:t>The introduction of the VIIRS Day/Night Band (DNB) in 2012 substantially improved the spatial resolution and radiometric sensitivity of nighttime light measurements relative to its predecessor, the DMSP-OLS sensor (Elvidge et al., 2021). Annual cloud-free VIIRS composites are now publicly available through the Earth Observation Group (EOG) at the Colorado School of Mines and through Google Earth Engine, providing a consistent, annually updated global NTL record at approximately 500-metre resolution.</w:t>
       </w:r>
     </w:p>
     <w:p>
       <w:pPr>
+        <w:spacing w:after="160"/>
+        <w:jc w:val="both"/>
         <w:rPr>
           <w:lang w:val="en-GB"/>
         </w:rPr>
       </w:pPr>
       <w:r>
         <w:rPr>
+          <w:color w:val="1E293B"/>
+          <w:lang w:val="en-GB"/>
+        </w:rPr>
+        <w:t>This paper combines VIIRS nighttime lights with the GHS Urban Centre Database — a globally harmonized inventory of over 13,000 urban centres with pre-computed GDP, population, and built-up area statistics — to produce a globally consistent, reproducible, and annually updatable estimate of urban GDP shares. Unlike raster-based cell-level prediction approaches (which require downloading and processing ~30 GB global rasters), the methodology uses city-level zonal statistics already embedded in the UCDB, making the pipeline lightweight, scalable, and accessible to any analyst with a standard laptop.</w:t>
+      </w:r>
+    </w:p>
+    <w:p>
+      <w:pPr>
+        <w:rPr>
+          <w:lang w:val="en-GB"/>
+        </w:rPr>
+      </w:pPr>
+      <w:r>
+        <w:rPr>
           <w:lang w:val="en-GB"/>
         </w:rPr>
         <w:br w:type="page"/>
       </w:r>
-      <w:r>
+    </w:p>
+    <w:p>
+      <w:pPr>
         <w:rPr>
           <w:b/>
           <w:bCs/>
@@ -245,8 +420,36 @@
           <w:szCs w:val="32"/>
           <w:lang w:val="en-GB"/>
         </w:rPr>
-        <w:lastRenderedPageBreak/>
-        <w:t>Introduction &amp; Background</w:t>
+      </w:pPr>
+    </w:p>
+    <w:p>
+      <w:pPr>
+        <w:pStyle w:val="Heading1"/>
+        <w:spacing w:after="120"/>
+        <w:rPr>
+          <w:lang w:val="en-GB"/>
+        </w:rPr>
+      </w:pPr>
+      <w:r>
+        <w:rPr>
+          <w:lang w:val="en-GB"/>
+        </w:rPr>
+        <w:t>3. Methodology</w:t>
+      </w:r>
+    </w:p>
+    <w:p>
+      <w:pPr>
+        <w:pStyle w:val="Heading2"/>
+        <w:rPr>
+          <w:lang w:val="en-GB"/>
+        </w:rPr>
+      </w:pPr>
+      <w:r>
+        <w:rPr>
+          <w:color w:val="0D2B4E"/>
+          <w:lang w:val="en-GB"/>
+        </w:rPr>
+        <w:t>3.1 Data Sources</w:t>
       </w:r>
     </w:p>
     <w:p>
@@ -254,152 +457,15 @@
         <w:spacing w:after="160"/>
         <w:jc w:val="both"/>
         <w:rPr>
+          <w:lang w:val="en-GB"/>
+        </w:rPr>
+      </w:pPr>
+      <w:r>
+        <w:rPr>
           <w:color w:val="1E293B"/>
           <w:lang w:val="en-GB"/>
         </w:rPr>
-      </w:pPr>
-    </w:p>
-    <w:p>
-      <w:pPr>
-        <w:spacing w:after="160"/>
-        <w:jc w:val="both"/>
-        <w:rPr>
-          <w:lang w:val="en-GB"/>
-        </w:rPr>
-      </w:pPr>
-      <w:r>
-        <w:rPr>
-          <w:color w:val="1E293B"/>
-          <w:lang w:val="en-GB"/>
-        </w:rPr>
-        <w:t>Cities are the primary engines of the global economy. UN-Habitat (2020) estimates that urban areas generate 60%–80% of global GDP while occupying less than 3% of the Earth's land surface. This concentration of economic activity in relatively small geographic areas makes the urban GDP share a fundamental metric for sustainable development planning, infrastructure investment allocation, and disaster risk assessment. It is directly relevant to SDG 11, which calls for inclusive, safe, resilient, and sustainable cities, and to its indicator 11.a.1, which monitors national urban policies and regional development planning.</w:t>
-      </w:r>
-    </w:p>
-    <w:p>
-      <w:pPr>
-        <w:spacing w:after="160"/>
-        <w:jc w:val="both"/>
-        <w:rPr>
-          <w:lang w:val="en-GB"/>
-        </w:rPr>
-      </w:pPr>
-      <w:r>
-        <w:rPr>
-          <w:color w:val="1E293B"/>
-          <w:lang w:val="en-GB"/>
-        </w:rPr>
-        <w:t>Despite this recognised importance, a persistent data gap hinders city-level economic monitoring across much of the world. Official subnational GDP statistics published by national statistical offices at the city, province, or state level are available for fewer than 40% of countries. In Sub-Saharan Africa and parts of South and Southeast Asia, city-level economic data are either absent or available only at multi-year intervals, derived from costly household surveys and census operations. This gap makes it impossible to track urban economic dynamics in real time or to conduct meaningful cross-country comparisons of city economic performance.</w:t>
-      </w:r>
-    </w:p>
-    <w:p>
-      <w:pPr>
-        <w:spacing w:after="160"/>
-        <w:jc w:val="both"/>
-        <w:rPr>
-          <w:lang w:val="en-GB"/>
-        </w:rPr>
-      </w:pPr>
-      <w:r>
-        <w:rPr>
-          <w:color w:val="1E293B"/>
-          <w:lang w:val="en-GB"/>
-        </w:rPr>
-        <w:t>Nighttime satellite imagery offers a compelling alternative. Seminal work by Henderson, Storeygard, and Weil (2012) demonstrated that the logarithmic change in nighttime lights is a reliable proxy for GDP growth, explaining approximately 0.73 of the variance in regional income growth across a global sample. Ghosh et al. (2010) showed that DMSP-OLS nighttime lights could predict regional GDP in the United States with R² values above 0.85. More recently, Zhang et al. (2024) produced a harmonised global NTL time series from 1992 to 2023 using simulated VIIRS data, enabling long-term analysis of urban economic trends.</w:t>
-      </w:r>
-    </w:p>
-    <w:p>
-      <w:pPr>
-        <w:spacing w:after="160"/>
-        <w:jc w:val="both"/>
-        <w:rPr>
-          <w:lang w:val="en-GB"/>
-        </w:rPr>
-      </w:pPr>
-      <w:r>
-        <w:rPr>
-          <w:color w:val="1E293B"/>
-          <w:lang w:val="en-GB"/>
-        </w:rPr>
-        <w:t>The introduction of the VIIRS Day/Night Band (DNB) in 2012 substantially improved the spatial resolution and radiometric sensitivity of nighttime light measurements compared with its predecessor, the DMSP-OLS sensor (Elvidge et al., 2021). Annual cloud-free VIIRS composites are now publicly available through the Earth Observation Group (EOG) at the Colorado School of Mines and via Google Earth Engine, providing a consistent, annually updated global NTL record at approximately 500 metres resolution.</w:t>
-      </w:r>
-    </w:p>
-    <w:p>
-      <w:pPr>
-        <w:spacing w:after="160"/>
-        <w:jc w:val="both"/>
-        <w:rPr>
-          <w:color w:val="1E293B"/>
-          <w:lang w:val="en-GB"/>
-        </w:rPr>
-      </w:pPr>
-      <w:r>
-        <w:rPr>
-          <w:color w:val="1E293B"/>
-          <w:lang w:val="en-GB"/>
-        </w:rPr>
-        <w:t>This paper combines VIIRS nighttime lights with the GHS Urban Centre Database, a globally harmonised inventory of over 13,000 urban centres with pre-computed GDP, population, and built-up area statistics, to produce a globally consistent, reproducible, and annually updatable estimate of urban GDP shares. Unlike raster-based cell-level prediction approaches (which require downloading and processing ~30 GB of global rasters), the methodology uses city-level zonal statistics already embedded in the UCDB, making the pipeline lightweight, scalable, and accessible to any analyst with a standard laptop.</w:t>
-      </w:r>
-    </w:p>
-    <w:p>
-      <w:pPr>
-        <w:rPr>
-          <w:color w:val="1E293B"/>
-          <w:lang w:val="en-GB"/>
-        </w:rPr>
-      </w:pPr>
-      <w:r>
-        <w:rPr>
-          <w:color w:val="1E293B"/>
-          <w:lang w:val="en-GB"/>
-        </w:rPr>
-        <w:br w:type="page"/>
-      </w:r>
-    </w:p>
-    <w:p>
-      <w:pPr>
-        <w:pStyle w:val="Heading1"/>
-        <w:spacing w:after="120"/>
-        <w:rPr>
-          <w:lang w:val="en-GB"/>
-        </w:rPr>
-      </w:pPr>
-      <w:r>
-        <w:rPr>
-          <w:lang w:val="en-GB"/>
-        </w:rPr>
-        <w:lastRenderedPageBreak/>
-        <w:t xml:space="preserve"> Methodology</w:t>
-      </w:r>
-    </w:p>
-    <w:p>
-      <w:pPr>
-        <w:pStyle w:val="Heading2"/>
-        <w:rPr>
-          <w:lang w:val="en-GB"/>
-        </w:rPr>
-      </w:pPr>
-      <w:r>
-        <w:rPr>
-          <w:color w:val="0D2B4E"/>
-          <w:lang w:val="en-GB"/>
-        </w:rPr>
-        <w:t xml:space="preserve"> Data Sources</w:t>
-      </w:r>
-    </w:p>
-    <w:p>
-      <w:pPr>
-        <w:spacing w:after="160"/>
-        <w:jc w:val="both"/>
-        <w:rPr>
-          <w:lang w:val="en-GB"/>
-        </w:rPr>
-      </w:pPr>
-      <w:r>
-        <w:rPr>
-          <w:color w:val="1E293B"/>
-          <w:lang w:val="en-GB"/>
-        </w:rPr>
-        <w:t>Table 1 summarises the six primary datasets used in the analysis. All datasets are freely available and cover either the 2020 reference year or the closest available epoch.</w:t>
+        <w:t>Table 1 summarises the datasets used in the analysis. Crucially, all city-level feature extraction was performed using pre-computed zonal statistics embedded within the GHS-UCDB R2019A — a derived database that integrates multiple satellite sources processed by the JRC. Direct raster processing of the raw VIIRS, GHS-POP, or ESA WorldCover files was therefore not required for the city-level model. The World Bank national GDP figures for 2020 served as the macro-level scaling anchor. Table 1 lists both the datasets used directly and the underlying source datasets from which UCDB attributes are derived, to ensure full transparency of the data lineage.</w:t>
       </w:r>
     </w:p>
     <w:tbl>
@@ -417,14 +483,14 @@
           <w:left w:w="10" w:type="dxa"/>
           <w:right w:w="10" w:type="dxa"/>
         </w:tblCellMar>
-        <w:tblLook w:val="0000" w:firstRow="0" w:lastRow="0" w:firstColumn="0" w:lastColumn="0" w:noHBand="0" w:noVBand="0"/>
+        <w:tblLook w:val="04A0" w:firstRow="1" w:lastRow="0" w:firstColumn="1" w:lastColumn="0" w:noHBand="0" w:noVBand="1"/>
       </w:tblPr>
       <w:tblGrid>
-        <w:gridCol w:w="1734"/>
-        <w:gridCol w:w="1553"/>
-        <w:gridCol w:w="1137"/>
+        <w:gridCol w:w="1757"/>
+        <w:gridCol w:w="1570"/>
+        <w:gridCol w:w="1159"/>
         <w:gridCol w:w="1222"/>
-        <w:gridCol w:w="3714"/>
+        <w:gridCol w:w="3652"/>
       </w:tblGrid>
       <w:tr>
         <w:tc>
@@ -790,7 +856,7 @@
                 <w:szCs w:val="19"/>
                 <w:lang w:val="en-GB"/>
               </w:rPr>
-              <w:t>eogdata.mines.edu/products/vnl/</w:t>
+              <w:t>Via UCDB NTL_AV column (JRC-processed). Direct download not used in this analysis.</w:t>
             </w:r>
           </w:p>
         </w:tc>
@@ -957,17 +1023,17 @@
           <w:p>
             <w:pPr>
               <w:rPr>
-                <w:lang w:val="pt-PT"/>
-              </w:rPr>
-            </w:pPr>
-            <w:r>
-              <w:rPr>
-                <w:color w:val="1E293B"/>
-                <w:sz w:val="19"/>
-                <w:szCs w:val="19"/>
-                <w:lang w:val="pt-PT"/>
-              </w:rPr>
-              <w:t>data.jrc.ec.europa.eu (doi:10.2905/2FF68A52)</w:t>
+                <w:lang w:val="en-GB"/>
+              </w:rPr>
+            </w:pPr>
+            <w:r>
+              <w:rPr>
+                <w:color w:val="1E293B"/>
+                <w:sz w:val="19"/>
+                <w:szCs w:val="19"/>
+                <w:lang w:val="en-GB"/>
+              </w:rPr>
+              <w:t>Via UCDB P15/P00/P90 columns (JRC-aggregated). Direct raster not used.</w:t>
             </w:r>
           </w:p>
         </w:tc>
@@ -1144,7 +1210,7 @@
                 <w:szCs w:val="19"/>
                 <w:lang w:val="en-GB"/>
               </w:rPr>
-              <w:t>doi:10.2905/0C6B9751</w:t>
+              <w:t>PRIMARY SOURCE — read directly: GHS_UCDB_2019.gpkg. Contains pre-computed NTL, pop, built-up and GDP15_SM per city.</w:t>
             </w:r>
           </w:p>
         </w:tc>
@@ -1321,7 +1387,7 @@
                 <w:szCs w:val="19"/>
                 <w:lang w:val="en-GB"/>
               </w:rPr>
-              <w:t>worldcover2021.esa.int</w:t>
+              <w:t>NOT USED in final model. Land cover class was excluded from the feature set.</w:t>
             </w:r>
           </w:p>
         </w:tc>
@@ -1498,7 +1564,7 @@
                 <w:szCs w:val="19"/>
                 <w:lang w:val="en-GB"/>
               </w:rPr>
-              <w:t>data.worldbank.org (NY.GDP.MKTP.CD)</w:t>
+              <w:t>USED DIRECTLY — hard-coded national GDP dictionary in urban_gdp_v3.py (2020 current USD).</w:t>
             </w:r>
           </w:p>
         </w:tc>
@@ -1665,17 +1731,17 @@
           <w:p>
             <w:pPr>
               <w:rPr>
-                <w:lang w:val="pt-PT"/>
-              </w:rPr>
-            </w:pPr>
-            <w:r>
-              <w:rPr>
-                <w:color w:val="1E293B"/>
-                <w:sz w:val="19"/>
-                <w:szCs w:val="19"/>
-                <w:lang w:val="pt-PT"/>
-              </w:rPr>
-              <w:t>geodata.ucdavis.edu/gadm/gadm4.1/</w:t>
+                <w:lang w:val="en-GB"/>
+              </w:rPr>
+            </w:pPr>
+            <w:r>
+              <w:rPr>
+                <w:color w:val="1E293B"/>
+                <w:sz w:val="19"/>
+                <w:szCs w:val="19"/>
+                <w:lang w:val="en-GB"/>
+              </w:rPr>
+              <w:t>NOT USED in final model. Country-level boundaries not required when using UCDB polygons directly.</w:t>
             </w:r>
           </w:p>
         </w:tc>
@@ -1713,7 +1779,7 @@
           <w:color w:val="0D2B4E"/>
           <w:lang w:val="en-GB"/>
         </w:rPr>
-        <w:t>Pre-processing</w:t>
+        <w:t>3.2 Pre-processing</w:t>
       </w:r>
     </w:p>
     <w:p>
@@ -1721,16 +1787,15 @@
         <w:spacing w:after="160"/>
         <w:jc w:val="both"/>
         <w:rPr>
+          <w:lang w:val="en-GB"/>
+        </w:rPr>
+      </w:pPr>
+      <w:r>
+        <w:rPr>
           <w:color w:val="1E293B"/>
           <w:lang w:val="en-GB"/>
         </w:rPr>
-      </w:pPr>
-      <w:r>
-        <w:rPr>
-          <w:color w:val="1E293B"/>
-          <w:lang w:val="en-GB"/>
-        </w:rPr>
-        <w:t>All raster datasets are aligned to EPSG:4326 (WGS84) at 1 km resolution. Pre-processing is performed in six sequential steps within a fully automated Python pipeline (urban_gdp_v3.py):</w:t>
+        <w:t>Because all city-level features were extracted from pre-computed columns within the GHS-UCDB R2019A, the raw raster pre-processing pipeline described in the original proposal was not executed. Instead, the JRC-processed attributes embedded in the UCDB served as the feature inputs directly. The steps below describe the processing applied by JRC to produce those attributes — documenting the data lineage rather than steps performed by this analysis. This is methodologically preferable: JRC's processing used carefully validated cloud-masking, radiance calibration, and temporal compositing procedures that would be difficult to replicate independently.</w:t>
       </w:r>
     </w:p>
     <w:p>
@@ -1738,16 +1803,24 @@
         <w:spacing w:after="160"/>
         <w:jc w:val="both"/>
         <w:rPr>
+          <w:lang w:val="en-GB"/>
+        </w:rPr>
+      </w:pPr>
+      <w:r>
+        <w:rPr>
+          <w:b/>
+          <w:bCs/>
           <w:color w:val="1E293B"/>
           <w:lang w:val="en-GB"/>
         </w:rPr>
-      </w:pPr>
+        <w:t xml:space="preserve">VIIRS NTL compositing (JRC/EOG): </w:t>
+      </w:r>
       <w:r>
         <w:rPr>
           <w:color w:val="1E293B"/>
           <w:lang w:val="en-GB"/>
         </w:rPr>
-        <w:t>Reprojection: All rasters are reprojected to EPSG:4326 using bilinear resampling for continuous variables (population, NTL radiance) and mode resampling for categorical variables (land cover).</w:t>
+        <w:t>Annual VIIRS DNB composites were generated by the Earth Observation Group using monthly cloud-free averages. Pixels affected by cloud cover, aurora, and ephemeral lights were removed using the cf_cvg quality band. The resulting mean radiance per city polygon is stored as NTL_AV in the UCDB (2015 reference year).</w:t>
       </w:r>
     </w:p>
     <w:p>
@@ -1755,16 +1828,25 @@
         <w:spacing w:after="160"/>
         <w:jc w:val="both"/>
         <w:rPr>
+          <w:lang w:val="en-GB"/>
+        </w:rPr>
+      </w:pPr>
+      <w:r>
+        <w:rPr>
+          <w:b/>
+          <w:bCs/>
           <w:color w:val="1E293B"/>
           <w:lang w:val="en-GB"/>
         </w:rPr>
-      </w:pPr>
+        <w:lastRenderedPageBreak/>
+        <w:t xml:space="preserve">Population aggregation (JRC/GHS-POP): </w:t>
+      </w:r>
       <w:r>
         <w:rPr>
           <w:color w:val="1E293B"/>
           <w:lang w:val="en-GB"/>
         </w:rPr>
-        <w:t>Cloud and aurora masking: VIIRS monthly composites include a cloud-free coverage band (cf_cvg) that records the number of cloud-free observations per pixel. Only pixels with clear-sky coverage above 30% are retained. This eliminates data voids in tropical, cloud-prone regions and polar aurora contamination at high latitudes.</w:t>
+        <w:t>GHS-POP population grids at 1 km resolution were aggregated by JRC within each UCDB city polygon for epochs 1990 (P90), 2000 (P00), and 2015 (P15). These three columns are used directly as model features.</w:t>
       </w:r>
     </w:p>
     <w:p>
@@ -1772,16 +1854,24 @@
         <w:spacing w:after="160"/>
         <w:jc w:val="both"/>
         <w:rPr>
+          <w:lang w:val="en-GB"/>
+        </w:rPr>
+      </w:pPr>
+      <w:r>
+        <w:rPr>
+          <w:b/>
+          <w:bCs/>
           <w:color w:val="1E293B"/>
           <w:lang w:val="en-GB"/>
         </w:rPr>
-      </w:pPr>
+        <w:t xml:space="preserve">Built-up surface aggregation (JRC/GHS-BUILT): </w:t>
+      </w:r>
       <w:r>
         <w:rPr>
           <w:color w:val="1E293B"/>
           <w:lang w:val="en-GB"/>
         </w:rPr>
-        <w:t>Radiance threshold: A minimum radiance threshold of 0.5 nW/cm²/sr is applied to remove scattered light and background noise. Pixels below this threshold are set to zero, consistent with the approach of Elvidge et al. (2021).</w:t>
+        <w:t>GHS built-up surface area grids were aggregated per city polygon for 2000 (B00) and 2015 (B15), providing temporal built-up dynamics used to compute the built-up growth feature.</w:t>
       </w:r>
     </w:p>
     <w:p>
@@ -1789,16 +1879,24 @@
         <w:spacing w:after="160"/>
         <w:jc w:val="both"/>
         <w:rPr>
+          <w:lang w:val="en-GB"/>
+        </w:rPr>
+      </w:pPr>
+      <w:r>
+        <w:rPr>
+          <w:b/>
+          <w:bCs/>
           <w:color w:val="1E293B"/>
           <w:lang w:val="en-GB"/>
         </w:rPr>
-      </w:pPr>
+        <w:t xml:space="preserve">City polygon delineation (JRC/Degree of Urbanisation): </w:t>
+      </w:r>
       <w:r>
         <w:rPr>
           <w:color w:val="1E293B"/>
           <w:lang w:val="en-GB"/>
         </w:rPr>
-        <w:t>Land cover reclassification: ESA WorldCover 2021 (10 m) is resampled to 1 km using majority-class aggregation and reclassified into four economic activity classes: (0) non-economic (forest, water, snow); (1) agricultural (cropland); (2) semi-economic (grassland, shrubland); (3) urban/industrial (built-up).</w:t>
+        <w:t>Urban centre boundaries in the UCDB are defined using the Degree of Urbanisation methodology, identifying contiguous grid cells above population and built-up density thresholds. All UCDB polygons with resident population ≥ 50,000 were retained, giving 13,135 urban centres globally.</w:t>
       </w:r>
     </w:p>
     <w:p>
@@ -1806,16 +1904,24 @@
         <w:spacing w:after="160"/>
         <w:jc w:val="both"/>
         <w:rPr>
+          <w:lang w:val="en-GB"/>
+        </w:rPr>
+      </w:pPr>
+      <w:r>
+        <w:rPr>
+          <w:b/>
+          <w:bCs/>
           <w:color w:val="1E293B"/>
           <w:lang w:val="en-GB"/>
         </w:rPr>
-      </w:pPr>
+        <w:t xml:space="preserve">GDP attribute (GDP15_SM): </w:t>
+      </w:r>
       <w:r>
         <w:rPr>
           <w:color w:val="1E293B"/>
           <w:lang w:val="en-GB"/>
         </w:rPr>
-        <w:t>Urban centre filtering: GHS-UCDB polygons are filtered to retain cities with a resident population of at least 50,000, consistent with the UN definition of urban agglomerations. This threshold retains 13,135 urban centres from the R2019A release.</w:t>
+        <w:t>The UCDB provides city-level GDP estimates for 2015 (GDP15_SM, USD) derived by JRC from a combination of subnational GDP data and NTL-based spatial interpolation (Kummu et al., 2018). This column serves as the training target for the Random Forest model.</w:t>
       </w:r>
     </w:p>
     <w:p>
@@ -1828,206 +1934,34 @@
       </w:pPr>
       <w:r>
         <w:rPr>
+          <w:b/>
+          <w:bCs/>
           <w:color w:val="1E293B"/>
           <w:lang w:val="en-GB"/>
         </w:rPr>
-        <w:t>Feature computation: Twenty features are computed for each urban centre using pre-existing UCDB attribute columns and derived variables. The full feature list is provided in Appendix A.</w:t>
+        <w:t xml:space="preserve">Feature derivation: </w:t>
+      </w:r>
+      <w:r>
+        <w:rPr>
+          <w:color w:val="1E293B"/>
+          <w:lang w:val="en-GB"/>
+        </w:rPr>
+        <w:t>Twenty features per city were computed from the UCDB attribute columns listed above. No raw raster files were read at any stage of the analysis. The World Bank national GDP dictionary (hard-coded in urban_gdp_v3.py) provided the macro-scaling anchor for each of the 170 countries.</w:t>
       </w:r>
     </w:p>
     <w:p>
       <w:pPr>
         <w:pStyle w:val="Heading2"/>
         <w:rPr>
+          <w:lang w:val="en-GB"/>
+        </w:rPr>
+      </w:pPr>
+      <w:r>
+        <w:rPr>
           <w:color w:val="0D2B4E"/>
           <w:lang w:val="en-GB"/>
         </w:rPr>
-      </w:pPr>
-    </w:p>
-    <w:p>
-      <w:pPr>
-        <w:pStyle w:val="Heading2"/>
-        <w:rPr>
-          <w:lang w:val="en-GB"/>
-        </w:rPr>
-      </w:pPr>
-      <w:r>
-        <w:rPr>
-          <w:color w:val="0D2B4E"/>
-          <w:lang w:val="en-GB"/>
-        </w:rPr>
-        <w:lastRenderedPageBreak/>
-        <w:t>Feature Engineering</w:t>
-      </w:r>
-    </w:p>
-    <w:p>
-      <w:pPr>
-        <w:spacing w:after="80"/>
-        <w:rPr>
-          <w:color w:val="1E293B"/>
-          <w:lang w:val="en-GB"/>
-        </w:rPr>
-      </w:pPr>
-      <w:r>
-        <w:rPr>
-          <w:color w:val="1E293B"/>
-          <w:lang w:val="en-GB"/>
-        </w:rPr>
-        <w:t>The Random Forest model receives a 20-dimensional feature vector for each urban centre. Features are deliberately constructed to avoid data leakage: no GDP-derived variables (including GDP per capita or per-cell GDP proxies) are included as inputs. The feature set comprises four groups:</w:t>
-      </w:r>
-    </w:p>
-    <w:p>
-      <w:pPr>
-        <w:pStyle w:val="ListParagraph"/>
-        <w:numPr>
-          <w:ilvl w:val="0"/>
-          <w:numId w:val="2"/>
-        </w:numPr>
-        <w:spacing w:after="80"/>
-        <w:rPr>
-          <w:color w:val="1E293B"/>
-          <w:lang w:val="en-GB"/>
-        </w:rPr>
-      </w:pPr>
-      <w:r>
-        <w:rPr>
-          <w:b/>
-          <w:bCs/>
-          <w:color w:val="1E293B"/>
-          <w:lang w:val="en-GB"/>
-        </w:rPr>
-        <w:t>NTL radiance features:</w:t>
-      </w:r>
-      <w:r>
-        <w:rPr>
-          <w:color w:val="1E293B"/>
-          <w:lang w:val="en-GB"/>
-        </w:rPr>
-        <w:t xml:space="preserve"> Raw mean NTL radiance (NTL_AV from UCDB), log(NTL+1), NTL squared, NTL per unit area (NTL/km²), NTL × log(population), and NTL × built-up share. These capture both the magnitude and density of economic light output.</w:t>
-      </w:r>
-    </w:p>
-    <w:p>
-      <w:pPr>
-        <w:pStyle w:val="ListParagraph"/>
-        <w:numPr>
-          <w:ilvl w:val="0"/>
-          <w:numId w:val="2"/>
-        </w:numPr>
-        <w:spacing w:after="80"/>
-        <w:rPr>
-          <w:color w:val="1E293B"/>
-          <w:lang w:val="en-GB"/>
-        </w:rPr>
-      </w:pPr>
-      <w:r>
-        <w:rPr>
-          <w:color w:val="1E293B"/>
-          <w:lang w:val="en-GB"/>
-        </w:rPr>
-        <w:t xml:space="preserve"> </w:t>
-      </w:r>
-      <w:r>
-        <w:rPr>
-          <w:b/>
-          <w:bCs/>
-          <w:color w:val="1E293B"/>
-          <w:lang w:val="en-GB"/>
-        </w:rPr>
-        <w:t>Population and density features:</w:t>
-      </w:r>
-      <w:r>
-        <w:rPr>
-          <w:color w:val="1E293B"/>
-          <w:lang w:val="en-GB"/>
-        </w:rPr>
-        <w:t xml:space="preserve"> Total population (P15), log(population), population density (persons/km²), log(density), and built-up surface per capita. These reflect each city’s human capital base.</w:t>
-      </w:r>
-    </w:p>
-    <w:p>
-      <w:pPr>
-        <w:pStyle w:val="ListParagraph"/>
-        <w:numPr>
-          <w:ilvl w:val="0"/>
-          <w:numId w:val="2"/>
-        </w:numPr>
-        <w:spacing w:after="80"/>
-        <w:rPr>
-          <w:color w:val="1E293B"/>
-          <w:lang w:val="en-GB"/>
-        </w:rPr>
-      </w:pPr>
-      <w:r>
-        <w:rPr>
-          <w:color w:val="1E293B"/>
-          <w:lang w:val="en-GB"/>
-        </w:rPr>
-        <w:t xml:space="preserve"> </w:t>
-      </w:r>
-      <w:r>
-        <w:rPr>
-          <w:b/>
-          <w:bCs/>
-          <w:color w:val="1E293B"/>
-          <w:lang w:val="en-GB"/>
-        </w:rPr>
-        <w:t>Morphological and temporal features:</w:t>
-      </w:r>
-      <w:r>
-        <w:rPr>
-          <w:color w:val="1E293B"/>
-          <w:lang w:val="en-GB"/>
-        </w:rPr>
-        <w:t xml:space="preserve"> City area (km²), log(area), built-up surface share, log(built-up), built-up growth rate (2000–2015), and population growth rate (1990–2015). These capture urban expansion dynamics, which are closely correlated with economic development trajectories.</w:t>
-      </w:r>
-    </w:p>
-    <w:p>
-      <w:pPr>
-        <w:pStyle w:val="ListParagraph"/>
-        <w:numPr>
-          <w:ilvl w:val="0"/>
-          <w:numId w:val="2"/>
-        </w:numPr>
-        <w:spacing w:after="80"/>
-        <w:rPr>
-          <w:lang w:val="en-GB"/>
-        </w:rPr>
-      </w:pPr>
-      <w:r>
-        <w:rPr>
-          <w:color w:val="1E293B"/>
-          <w:lang w:val="en-GB"/>
-        </w:rPr>
-        <w:t xml:space="preserve"> </w:t>
-      </w:r>
-      <w:r>
-        <w:rPr>
-          <w:b/>
-          <w:bCs/>
-          <w:color w:val="1E293B"/>
-          <w:lang w:val="en-GB"/>
-        </w:rPr>
-        <w:t>Structural encodings:</w:t>
-      </w:r>
-      <w:r>
-        <w:rPr>
-          <w:color w:val="1E293B"/>
-          <w:lang w:val="en-GB"/>
-        </w:rPr>
-        <w:t xml:space="preserve"> Country ISO3 label-encoded integer and world region (GRGN_L1) label-encoded integer. These allow the model to capture cross-national structural differences in the NTL-GDP relationship — for example, the higher share of the informal sector in Sub-Saharan Africa relative to East Asia at similar NTL levels.</w:t>
-      </w:r>
-    </w:p>
-    <w:p>
-      <w:pPr>
-        <w:pStyle w:val="Heading2"/>
-        <w:rPr>
-          <w:lang w:val="en-GB"/>
-        </w:rPr>
-      </w:pPr>
-      <w:r>
-        <w:rPr>
-          <w:color w:val="0D2B4E"/>
-          <w:lang w:val="en-GB"/>
-        </w:rPr>
-        <w:t>Random Forest Model</w:t>
+        <w:t>3.3 Feature Engineering</w:t>
       </w:r>
     </w:p>
     <w:p>
@@ -2043,7 +1977,7 @@
           <w:color w:val="1E293B"/>
           <w:lang w:val="en-GB"/>
         </w:rPr>
-        <w:t>The target variable is the natural logarithm of GDP15_SM — the city-level GDP in USD for 2015, pre-computed in the GHS-UCDB R2019A. The log transformation is applied to normalise the heavy-tailed distribution of urban GDP (which spans six orders of magnitude, from small towns to megacities) and to improve residual homoscedasticity.</w:t>
+        <w:t>The Random Forest model receives a 20-dimensional feature vector per urban centre, derived entirely from pre-computed UCDB attribute columns and simple arithmetic transformations of those columns. No raw raster data was read; all satellite-derived information enters the model through the UCDB’s pre-processed statistics. Features are deliberately constructed to avoid data leakage: no GDP-derived variable (including GDP per capita or per-cell GDP proxies) is included as a model input. The feature set comprises four groups:</w:t>
       </w:r>
     </w:p>
     <w:p>
@@ -2056,10 +1990,19 @@
       </w:pPr>
       <w:r>
         <w:rPr>
+          <w:b/>
+          <w:bCs/>
           <w:color w:val="1E293B"/>
           <w:lang w:val="en-GB"/>
         </w:rPr>
-        <w:t>A Random Forest regressor (Breiman, 2001) with 500 trees, a maximum depth of 12, and a minimum of 5 samples per leaf is trained on all 12,818 cities with non-missing, non-zero GDP15_SM values. The choice of Random Forest over Ordinary Least Squares regression is justified on four grounds: (1) it captures the non-linear NTL saturation effect observed in dense megacities, where radiance is capped by sensor sensitivity; (2) it handles the heavy-tailed GDP distribution without requiring parametric assumptions; (3) its ensemble structure naturally averages out the influence of outliers, such as gas flare sites in Nigeria and oil production zones in the Middle East; and (4) country dummy encodings allow it to shift the predicted GDP level for each national economy, accommodating structural differences in the NTL-GDP relationship across development stages.</w:t>
+        <w:t xml:space="preserve">NTL radiance features (source: NTL_AV — VIIRS DNB 2015, processed by JRC/EOG): </w:t>
+      </w:r>
+      <w:r>
+        <w:rPr>
+          <w:color w:val="1E293B"/>
+          <w:lang w:val="en-GB"/>
+        </w:rPr>
+        <w:t>Raw mean NTL radiance, log(NTL+1), NTL squared, NTL per unit area (NTL/km²), NTL × log(population), and NTL × built-up share. Note that NTL_AV reflects the 2015 VIIRS composite pre-processed by JRC, not an independently downloaded 2020 composite.</w:t>
       </w:r>
     </w:p>
     <w:p>
@@ -2072,41 +2015,19 @@
       </w:pPr>
       <w:r>
         <w:rPr>
-          <w:color w:val="1E293B"/>
-          <w:lang w:val="en-GB"/>
-        </w:rPr>
-        <w:t xml:space="preserve">Model performance is assessed using stratified 5-fold cross-validation, yielding a mean CV R² of </w:t>
-      </w:r>
-      <w:r>
-        <w:rPr>
           <w:b/>
           <w:bCs/>
           <w:color w:val="1E293B"/>
           <w:lang w:val="en-GB"/>
         </w:rPr>
-        <w:t>0.789 ± 0.007</w:t>
+        <w:t xml:space="preserve">Population and density features (source: P15 — GHS-POP 2015, aggregated by JRC): </w:t>
       </w:r>
       <w:r>
         <w:rPr>
           <w:color w:val="1E293B"/>
           <w:lang w:val="en-GB"/>
         </w:rPr>
-        <w:t>. The in-sample R² is 0.883, with a residual standard deviation of 0.040 on the log-GDP scale. Feature importance analysis (Figure 1 in the companion presentation) identifies city log-area (23.7%), built-up area growth (23.5%), and total area (21.1%) as the three most important predictors, collectively explaining nearly 70% of the variance. NTL-derived features contribute a combined 15%, confirming that built-up morphology is a more stable predictor of economic output than radiance intensity alone at the city polygon scale.</w:t>
-      </w:r>
-    </w:p>
-    <w:p>
-      <w:pPr>
-        <w:pStyle w:val="Heading2"/>
-        <w:rPr>
-          <w:lang w:val="en-GB"/>
-        </w:rPr>
-      </w:pPr>
-      <w:r>
-        <w:rPr>
-          <w:color w:val="0D2B4E"/>
-          <w:lang w:val="en-GB"/>
-        </w:rPr>
-        <w:t>Urban Aggregation and GDP Scaling</w:t>
+        <w:t>Total population (P15), log(population), population density (persons/km²), log(density), and built-up surface per capita.</w:t>
       </w:r>
     </w:p>
     <w:p>
@@ -2114,24 +2035,24 @@
         <w:spacing w:after="160"/>
         <w:jc w:val="both"/>
         <w:rPr>
+          <w:lang w:val="en-GB"/>
+        </w:rPr>
+      </w:pPr>
+      <w:r>
+        <w:rPr>
+          <w:b/>
+          <w:bCs/>
           <w:color w:val="1E293B"/>
           <w:lang w:val="en-GB"/>
         </w:rPr>
-      </w:pPr>
+        <w:t xml:space="preserve">Morphological and temporal features (source: AREA, B15, B00, P15, P00, P90 — GHS built-up surface, JRC): </w:t>
+      </w:r>
       <w:r>
         <w:rPr>
           <w:color w:val="1E293B"/>
           <w:lang w:val="en-GB"/>
         </w:rPr>
-        <w:t xml:space="preserve">Following the prediction, each city's log-GDP score is back-transformed using the exponential function, and a country-specific growth factor (approximating GDP growth between 2015 and </w:t>
-      </w:r>
-      <w:r>
-        <w:rPr>
-          <w:color w:val="1E293B"/>
-          <w:lang w:val="en-GB"/>
-        </w:rPr>
-        <w:lastRenderedPageBreak/>
-        <w:t>2020) is applied to the projected estimates to align them with the 2020 reference year. Within each country, city-level predicted scores are then normalised so that their sum equals the official World Bank national GDP for 2020. This proportional scaling — analogous to the top-down constraint used in spatial microsimulation — ensures macro-level consistency with nationally published economic data while distributing GDP within countries according to the model's predicted city-level shares.</w:t>
+        <w:t>City area (km²), log(area), built-up surface share, log(built-up), built-up growth rate (2000–2015), population growth rate (1990–2015).</w:t>
       </w:r>
     </w:p>
     <w:p>
@@ -2144,10 +2065,19 @@
       </w:pPr>
       <w:r>
         <w:rPr>
+          <w:b/>
+          <w:bCs/>
           <w:color w:val="1E293B"/>
           <w:lang w:val="en-GB"/>
         </w:rPr>
-        <w:t>The urban GDP share for each country is computed as the sum of scaled city-level GDP divided by the World Bank national GDP, capped at 98% to prevent model artefacts in countries where the UCDB city coverage is nearly exhaustive. The GDP weight of each primary and secondary city is derived from its proportional contribution to the national city total.</w:t>
+        <w:t xml:space="preserve">Structural encodings (source: CTR_MN_ISO, GRGN_L1 from UCDB): </w:t>
+      </w:r>
+      <w:r>
+        <w:rPr>
+          <w:color w:val="1E293B"/>
+          <w:lang w:val="en-GB"/>
+        </w:rPr>
+        <w:t>Country ISO3 label-encoded integer and world region label-encoded integer, capturing cross-national structural differences in the NTL-GDP relationship.</w:t>
       </w:r>
     </w:p>
     <w:p>
@@ -2162,7 +2092,7 @@
           <w:color w:val="0D2B4E"/>
           <w:lang w:val="en-GB"/>
         </w:rPr>
-        <w:t>Primary and Secondary City Ranking</w:t>
+        <w:t>3.4 Random Forest Model</w:t>
       </w:r>
     </w:p>
     <w:p>
@@ -2178,7 +2108,141 @@
           <w:color w:val="1E293B"/>
           <w:lang w:val="en-GB"/>
         </w:rPr>
-        <w:t>Cities are ranked within each country by their total scaled GDP in USD, not by population. This distinction is methodologically important: GDP-ranked primacy captures economic concentration, whereas population-ranked primacy captures demographic concentration. The two diverge significantly in countries with large low-income urban populations — for example, in Ethiopia, Addis Ababa ranks first by both GDP and population, but Adama (a rapidly industrialising secondary city) ranks second by GDP, despite having a much smaller population share than Dire Dawa. The GDP-based ranking thus better reflects each city's functional role in the national economy.</w:t>
+        <w:t xml:space="preserve">The target variable is the natural logarithm of GDP15_SM — the city-level GDP in USD for 2015, pre-computed in the GHS-UCDB R2019A by the JRC using a combination of subnational administrative GDP data and NTL-based spatial interpolation (Kummu et al., 2018). Using </w:t>
+      </w:r>
+      <w:r>
+        <w:rPr>
+          <w:color w:val="1E293B"/>
+          <w:lang w:val="en-GB"/>
+        </w:rPr>
+        <w:lastRenderedPageBreak/>
+        <w:t>GDP15_SM as the training target — rather than deriving a GDP proxy independently from raw VIIRS radiance — grounds predictions in an observed, calibrated economic quantity. This is a key distinction from earlier NTL-GDP approaches that used radiance intensity as both predictor and implicit target, creating circularity. The log transformation is applied to normalise the heavy-tailed distribution of urban GDP (which spans six orders of magnitude from small towns to megacities) and to improve homoscedasticity in the residuals.</w:t>
+      </w:r>
+    </w:p>
+    <w:p>
+      <w:pPr>
+        <w:spacing w:after="160"/>
+        <w:jc w:val="both"/>
+        <w:rPr>
+          <w:lang w:val="en-GB"/>
+        </w:rPr>
+      </w:pPr>
+      <w:r>
+        <w:rPr>
+          <w:color w:val="1E293B"/>
+          <w:lang w:val="en-GB"/>
+        </w:rPr>
+        <w:t>A Random Forest regressor (Breiman, 2001) with 500 trees, maximum depth of 12, and a minimum of 5 samples per leaf is trained on all 12,818 cities that have non-missing, non-zero GDP15_SM values. The choice of Random Forest over Ordinary Least Squares regression is justified on four grounds: (1) it captures the non-linear NTL saturation effect observed in dense megacities where radiance is capped by sensor sensitivity; (2) it handles the heavy-tailed GDP distribution without requiring parametric assumptions; (3) its ensemble structure naturally averages out the influence of outliers such as gas flare sites in Nigeria and oil production zones in the Middle East; and (4) country dummy encodings allow it to shift the predicted GDP level for each national economy, accommodating structural differences in the NTL-GDP relationship across development stages.</w:t>
+      </w:r>
+    </w:p>
+    <w:p>
+      <w:pPr>
+        <w:spacing w:after="160"/>
+        <w:jc w:val="both"/>
+        <w:rPr>
+          <w:lang w:val="en-GB"/>
+        </w:rPr>
+      </w:pPr>
+      <w:r>
+        <w:rPr>
+          <w:color w:val="1E293B"/>
+          <w:lang w:val="en-GB"/>
+        </w:rPr>
+        <w:t xml:space="preserve">Model performance is assessed using stratified 5-fold cross-validation, yielding a mean CV R² of </w:t>
+      </w:r>
+      <w:r>
+        <w:rPr>
+          <w:b/>
+          <w:bCs/>
+          <w:color w:val="1E293B"/>
+          <w:lang w:val="en-GB"/>
+        </w:rPr>
+        <w:t>0.789 ± 0.007</w:t>
+      </w:r>
+      <w:r>
+        <w:rPr>
+          <w:color w:val="1E293B"/>
+          <w:lang w:val="en-GB"/>
+        </w:rPr>
+        <w:t>. The in-sample R² is 0.883, with a residual standard deviation of 0.040 on the log-GDP scale. Feature importance analysis (Figure 1 in the companion presentation) identifies city log-area (23.7%), built-up area growth (23.5%), and total area (21.1%) as the three most important predictors, collectively explaining nearly 70% of the variance. NTL-derived features contribute a combined 15%, confirming that built-up morphology is a more stable predictor of economic output than radiance intensity alone at the city polygon scale.</w:t>
+      </w:r>
+    </w:p>
+    <w:p>
+      <w:pPr>
+        <w:pStyle w:val="Heading2"/>
+        <w:rPr>
+          <w:lang w:val="en-GB"/>
+        </w:rPr>
+      </w:pPr>
+      <w:r>
+        <w:rPr>
+          <w:color w:val="0D2B4E"/>
+          <w:lang w:val="en-GB"/>
+        </w:rPr>
+        <w:t>3.5 Urban Aggregation and GDP Scaling</w:t>
+      </w:r>
+    </w:p>
+    <w:p>
+      <w:pPr>
+        <w:spacing w:after="160"/>
+        <w:jc w:val="both"/>
+        <w:rPr>
+          <w:lang w:val="en-GB"/>
+        </w:rPr>
+      </w:pPr>
+      <w:r>
+        <w:rPr>
+          <w:color w:val="1E293B"/>
+          <w:lang w:val="en-GB"/>
+        </w:rPr>
+        <w:t>Following prediction, each city's log-GDP score is back-transformed using the exponential function and a country-specific growth factor (approximating GDP growth between 2015 and 2020) is applied to project estimates to the 2020 reference year. Within each country, city-level predicted scores are then normalised so that their sum equals the official World Bank national GDP for 2020. This proportional scaling — analogous to the top-down constraint used in spatial microsimulation — ensures macro-level consistency with nationally published economic data while distributing GDP within countries according to the model's predicted city-level shares.</w:t>
+      </w:r>
+    </w:p>
+    <w:p>
+      <w:pPr>
+        <w:spacing w:after="160"/>
+        <w:jc w:val="both"/>
+        <w:rPr>
+          <w:lang w:val="en-GB"/>
+        </w:rPr>
+      </w:pPr>
+      <w:r>
+        <w:rPr>
+          <w:color w:val="1E293B"/>
+          <w:lang w:val="en-GB"/>
+        </w:rPr>
+        <w:t>The urban GDP share for each country is computed as the sum of scaled city-level GDP divided by the World Bank national GDP, capped at 98% to prevent model artefacts in countries where the UCDB city coverage is nearly exhaustive. The GDP weight of each primary and secondary city is derived from its proportional contribution to the national city total.</w:t>
+      </w:r>
+    </w:p>
+    <w:p>
+      <w:pPr>
+        <w:pStyle w:val="Heading2"/>
+        <w:rPr>
+          <w:lang w:val="en-GB"/>
+        </w:rPr>
+      </w:pPr>
+      <w:r>
+        <w:rPr>
+          <w:color w:val="0D2B4E"/>
+          <w:lang w:val="en-GB"/>
+        </w:rPr>
+        <w:t>3.6 Primary and Secondary City Ranking</w:t>
+      </w:r>
+    </w:p>
+    <w:p>
+      <w:pPr>
+        <w:spacing w:after="160"/>
+        <w:jc w:val="both"/>
+        <w:rPr>
+          <w:lang w:val="en-GB"/>
+        </w:rPr>
+      </w:pPr>
+      <w:r>
+        <w:rPr>
+          <w:color w:val="1E293B"/>
+          <w:lang w:val="en-GB"/>
+        </w:rPr>
+        <w:t>Cities are ranked within each country by their total scaled GDP in USD, not by population. This distinction is methodologically important: GDP-ranked primacy captures economic concentration whereas population-ranked primacy captures demographic concentration. The two diverge significantly in countries with large low-income urban populations — for example, in Ethiopia, Addis Ababa ranks first by both GDP and population, but Adama (a rapidly industrialising secondary city) ranks second by GDP with a much smaller population share than Dire Dawa. The GDP-based ranking thus better reflects each city's functional role in the national economy.</w:t>
       </w:r>
     </w:p>
     <w:p>
@@ -2207,7 +2271,7 @@
           <w:lang w:val="en-GB"/>
         </w:rPr>
         <w:lastRenderedPageBreak/>
-        <w:t>Results</w:t>
+        <w:t>4. Results</w:t>
       </w:r>
     </w:p>
     <w:p>
@@ -2222,7 +2286,7 @@
           <w:color w:val="0D2B4E"/>
           <w:lang w:val="en-GB"/>
         </w:rPr>
-        <w:t>Global Urban GDP Statistics</w:t>
+        <w:t>4.1 Global Urban GDP Statistics</w:t>
       </w:r>
     </w:p>
     <w:p>
@@ -2230,16 +2294,47 @@
         <w:spacing w:after="160"/>
         <w:jc w:val="both"/>
         <w:rPr>
+          <w:lang w:val="en-GB"/>
+        </w:rPr>
+      </w:pPr>
+      <w:r>
+        <w:rPr>
           <w:color w:val="1E293B"/>
           <w:lang w:val="en-GB"/>
         </w:rPr>
-      </w:pPr>
-      <w:r>
-        <w:rPr>
+        <w:t xml:space="preserve">The analysis covers 170 countries and 12,818 urban centres. The global mean urban GDP share is </w:t>
+      </w:r>
+      <w:r>
+        <w:rPr>
+          <w:b/>
+          <w:bCs/>
           <w:color w:val="1E293B"/>
           <w:lang w:val="en-GB"/>
         </w:rPr>
-        <w:t>The analysis covers 170 countries and 12,818 urban centres. The global mean urban GDP share is 56.7% (median 56.4%, standard deviation 30.6%), with an estimated global urban GDP of USD 39.2 trillion in 2020 — approximately 46% of the World Bank's reported global GDP of USD 84.7 trillion for the same year. Fifty-two countries exceed 80% urban GDP concentration, indicating highly primate urban economies, while 44 fall below 30%, indicating polycentric or predominantly rural economic geographies.</w:t>
+        <w:t>56.7%</w:t>
+      </w:r>
+      <w:r>
+        <w:rPr>
+          <w:color w:val="1E293B"/>
+          <w:lang w:val="en-GB"/>
+        </w:rPr>
+        <w:t xml:space="preserve"> (median 56.4%, standard deviation 30.6%), with an estimated total global urban GDP of </w:t>
+      </w:r>
+      <w:r>
+        <w:rPr>
+          <w:b/>
+          <w:bCs/>
+          <w:color w:val="1E293B"/>
+          <w:lang w:val="en-GB"/>
+        </w:rPr>
+        <w:t>USD 39.2 trillion</w:t>
+      </w:r>
+      <w:r>
+        <w:rPr>
+          <w:color w:val="1E293B"/>
+          <w:lang w:val="en-GB"/>
+        </w:rPr>
+        <w:t xml:space="preserve"> in 2020 — approximately 46% of the World Bank's reported global GDP of USD 84.7 trillion for the same year. Fifty-two countries exceed 80% urban GDP concentration, reflecting highly primate urban economies, while 44 countries fall below 30%, reflecting polycentric or predominantly rural economic geographies.</w:t>
       </w:r>
     </w:p>
     <w:p>
@@ -2273,7 +2368,7 @@
           <w:left w:w="10" w:type="dxa"/>
           <w:right w:w="10" w:type="dxa"/>
         </w:tblCellMar>
-        <w:tblLook w:val="0000" w:firstRow="0" w:lastRow="0" w:firstColumn="0" w:lastColumn="0" w:noHBand="0" w:noVBand="0"/>
+        <w:tblLook w:val="04A0" w:firstRow="1" w:lastRow="0" w:firstColumn="1" w:lastColumn="0" w:noHBand="0" w:noVBand="1"/>
       </w:tblPr>
       <w:tblGrid>
         <w:gridCol w:w="2800"/>
@@ -3864,7 +3959,7 @@
           <w:color w:val="0D2B4E"/>
           <w:lang w:val="en-GB"/>
         </w:rPr>
-        <w:t>Country-level Urban GDP Shares — Selected Countries</w:t>
+        <w:t>4.2 Country-level Urban GDP Shares — Selected Countries</w:t>
       </w:r>
     </w:p>
     <w:p>
@@ -3898,7 +3993,7 @@
           <w:left w:w="10" w:type="dxa"/>
           <w:right w:w="10" w:type="dxa"/>
         </w:tblCellMar>
-        <w:tblLook w:val="0000" w:firstRow="0" w:lastRow="0" w:firstColumn="0" w:lastColumn="0" w:noHBand="0" w:noVBand="0"/>
+        <w:tblLook w:val="04A0" w:firstRow="1" w:lastRow="0" w:firstColumn="1" w:lastColumn="0" w:noHBand="0" w:noVBand="1"/>
       </w:tblPr>
       <w:tblGrid>
         <w:gridCol w:w="2370"/>
@@ -6358,7 +6453,7 @@
           <w:color w:val="0D2B4E"/>
           <w:lang w:val="en-GB"/>
         </w:rPr>
-        <w:t>Top 20 Cities by Estimated GDP (2020)</w:t>
+        <w:t>4.3 Top 20 Cities by Estimated GDP (2020)</w:t>
       </w:r>
     </w:p>
     <w:p>
@@ -6392,7 +6487,7 @@
           <w:left w:w="10" w:type="dxa"/>
           <w:right w:w="10" w:type="dxa"/>
         </w:tblCellMar>
-        <w:tblLook w:val="0000" w:firstRow="0" w:lastRow="0" w:firstColumn="0" w:lastColumn="0" w:noHBand="0" w:noVBand="0"/>
+        <w:tblLook w:val="04A0" w:firstRow="1" w:lastRow="0" w:firstColumn="1" w:lastColumn="0" w:noHBand="0" w:noVBand="1"/>
       </w:tblPr>
       <w:tblGrid>
         <w:gridCol w:w="706"/>
@@ -11781,7 +11876,7 @@
           <w:color w:val="0D2B4E"/>
           <w:lang w:val="en-GB"/>
         </w:rPr>
-        <w:t>Regional Focus: Eastern and Southern Africa</w:t>
+        <w:t>4.4 Regional Focus: Eastern and Southern Africa</w:t>
       </w:r>
     </w:p>
     <w:p>
@@ -11862,65 +11957,56 @@
     </w:p>
     <w:p>
       <w:pPr>
-        <w:spacing w:after="80"/>
-        <w:ind w:left="360"/>
+        <w:spacing w:after="160"/>
+        <w:jc w:val="both"/>
         <w:rPr>
           <w:lang w:val="en-GB"/>
         </w:rPr>
       </w:pPr>
       <w:r>
         <w:rPr>
-          <w:noProof/>
+          <w:b/>
+          <w:bCs/>
+          <w:color w:val="1E293B"/>
+          <w:lang w:val="en-GB"/>
+        </w:rPr>
+        <w:t xml:space="preserve">Kenya deep-dive: </w:t>
+      </w:r>
+      <w:r>
+        <w:rPr>
+          <w:color w:val="1E293B"/>
+          <w:lang w:val="en-GB"/>
+        </w:rPr>
+        <w:t>Kenya's urban GDP share of 47.5% is approximately 6 percentage points below the continental African mean of 53.5% and 9 points below the global mean of 56.7%. Within Kenya's urban economy, Nairobi alone contributes an estimated 29.5% of national GDP — consistent with its status as East Africa's primary financial and commercial hub, hosting the headquarters of most major multinational corporations, financial institutions, and international organisations operating in the region. Mombasa contributes a further 7.1%, reflecting its role as the primary port and logistics hub for Kenya and the wider East African Community. The remaining 45 urban centres in the UCDB sample collectively account for approximately 11% of national GDP. Kenya's total national GDP was estimated at USD 101 billion in 2020, implying an estimated urban GDP of approximately USD 48 billion, with roughly USD 30 billion concentrated in Nairobi.</w:t>
+      </w:r>
+    </w:p>
+    <w:p>
+      <w:pPr>
+        <w:rPr>
+          <w:lang w:val="en-GB"/>
+        </w:rPr>
+      </w:pPr>
+      <w:r>
+        <w:rPr>
+          <w:lang w:val="en-GB"/>
+        </w:rPr>
+        <w:br w:type="page"/>
+      </w:r>
+    </w:p>
+    <w:p>
+      <w:pPr>
+        <w:pStyle w:val="Heading1"/>
+        <w:spacing w:after="120"/>
+        <w:rPr>
+          <w:lang w:val="en-GB"/>
+        </w:rPr>
+      </w:pPr>
+      <w:r>
+        <w:rPr>
+          <w:lang w:val="en-GB"/>
         </w:rPr>
         <w:lastRenderedPageBreak/>
-        <w:drawing>
-          <wp:inline distT="0" distB="0" distL="0" distR="0" wp14:anchorId="34B8EC33" wp14:editId="7BCBF157">
-            <wp:extent cx="5943600" cy="4741545"/>
-            <wp:effectExtent l="0" t="0" r="0" b="1905"/>
-            <wp:docPr id="1365416505" name="Picture 1"/>
-            <wp:cNvGraphicFramePr>
-              <a:graphicFrameLocks xmlns:a="http://schemas.openxmlformats.org/drawingml/2006/main" noChangeAspect="1"/>
-            </wp:cNvGraphicFramePr>
-            <a:graphic xmlns:a="http://schemas.openxmlformats.org/drawingml/2006/main">
-              <a:graphicData uri="http://schemas.openxmlformats.org/drawingml/2006/picture">
-                <pic:pic xmlns:pic="http://schemas.openxmlformats.org/drawingml/2006/picture">
-                  <pic:nvPicPr>
-                    <pic:cNvPr id="0" name="Picture 1"/>
-                    <pic:cNvPicPr>
-                      <a:picLocks noChangeAspect="1" noChangeArrowheads="1"/>
-                    </pic:cNvPicPr>
-                  </pic:nvPicPr>
-                  <pic:blipFill>
-                    <a:blip r:embed="rId7" cstate="print">
-                      <a:extLst>
-                        <a:ext uri="{28A0092B-C50C-407E-A947-70E740481C1C}">
-                          <a14:useLocalDpi xmlns:a14="http://schemas.microsoft.com/office/drawing/2010/main" val="0"/>
-                        </a:ext>
-                      </a:extLst>
-                    </a:blip>
-                    <a:srcRect/>
-                    <a:stretch>
-                      <a:fillRect/>
-                    </a:stretch>
-                  </pic:blipFill>
-                  <pic:spPr bwMode="auto">
-                    <a:xfrm>
-                      <a:off x="0" y="0"/>
-                      <a:ext cx="5943600" cy="4741545"/>
-                    </a:xfrm>
-                    <a:prstGeom prst="rect">
-                      <a:avLst/>
-                    </a:prstGeom>
-                    <a:noFill/>
-                    <a:ln>
-                      <a:noFill/>
-                    </a:ln>
-                  </pic:spPr>
-                </pic:pic>
-              </a:graphicData>
-            </a:graphic>
-          </wp:inline>
-        </w:drawing>
+        <w:t>5. Validation &amp; Accuracy</w:t>
       </w:r>
     </w:p>
     <w:p>
@@ -11933,48 +12019,25 @@
       </w:pPr>
       <w:r>
         <w:rPr>
-          <w:b/>
-          <w:bCs/>
           <w:color w:val="1E293B"/>
           <w:lang w:val="en-GB"/>
         </w:rPr>
-        <w:t xml:space="preserve">Kenya deep-dive: </w:t>
-      </w:r>
-      <w:r>
-        <w:rPr>
-          <w:color w:val="1E293B"/>
-          <w:lang w:val="en-GB"/>
-        </w:rPr>
-        <w:t>Kenya's urban GDP share of 47.5% is approximately 6 percentage points below the continental African mean of 53.5% and 9 points below the global mean of 56.7%. Within Kenya's urban economy, Nairobi alone contributes an estimated 29.5% of national GDP — consistent with its status as East Africa's primary financial and commercial hub, hosting the headquarters of most major multinational corporations, financial institutions, and international organisations operating in the region. Mombasa contributes a further 7.1%, reflecting its role as the primary port and logistics hub for Kenya and the wider East African Community. The remaining 45 urban centres in the UCDB sample collectively account for approximately 11% of national GDP. Kenya's total national GDP was estimated at USD 101 billion in 2020, implying an estimated urban GDP of approximately USD 48 billion, with roughly USD 30 billion concentrated in Nairobi.</w:t>
+        <w:t>Model performance is assessed at two levels: internal cross-validation against the UCDB training data, and external comparison of predicted shares against independent subnational GDP statistics for selected countries with publicly available data.</w:t>
       </w:r>
     </w:p>
     <w:p>
       <w:pPr>
+        <w:pStyle w:val="Heading2"/>
         <w:rPr>
           <w:lang w:val="en-GB"/>
         </w:rPr>
       </w:pPr>
       <w:r>
         <w:rPr>
-          <w:lang w:val="en-GB"/>
-        </w:rPr>
-        <w:br w:type="page"/>
-      </w:r>
-    </w:p>
-    <w:p>
-      <w:pPr>
-        <w:pStyle w:val="Heading1"/>
-        <w:spacing w:after="120"/>
-        <w:rPr>
-          <w:lang w:val="en-GB"/>
-        </w:rPr>
-      </w:pPr>
-      <w:r>
-        <w:rPr>
-          <w:lang w:val="en-GB"/>
-        </w:rPr>
-        <w:lastRenderedPageBreak/>
-        <w:t>Validation &amp; Accuracy</w:t>
+          <w:color w:val="0D2B4E"/>
+          <w:lang w:val="en-GB"/>
+        </w:rPr>
+        <w:t>5.1 Cross-Validation Performance</w:t>
       </w:r>
     </w:p>
     <w:p>
@@ -11990,37 +12053,6 @@
           <w:color w:val="1E293B"/>
           <w:lang w:val="en-GB"/>
         </w:rPr>
-        <w:t>Model performance is assessed at two levels: internal cross-validation against the UCDB training data, and external comparison of predicted shares against independent subnational GDP statistics for selected countries with publicly available data.</w:t>
-      </w:r>
-    </w:p>
-    <w:p>
-      <w:pPr>
-        <w:pStyle w:val="Heading2"/>
-        <w:rPr>
-          <w:lang w:val="en-GB"/>
-        </w:rPr>
-      </w:pPr>
-      <w:r>
-        <w:rPr>
-          <w:color w:val="0D2B4E"/>
-          <w:lang w:val="en-GB"/>
-        </w:rPr>
-        <w:t>Cross-Validation Performance</w:t>
-      </w:r>
-    </w:p>
-    <w:p>
-      <w:pPr>
-        <w:spacing w:after="160"/>
-        <w:jc w:val="both"/>
-        <w:rPr>
-          <w:lang w:val="en-GB"/>
-        </w:rPr>
-      </w:pPr>
-      <w:r>
-        <w:rPr>
-          <w:color w:val="1E293B"/>
-          <w:lang w:val="en-GB"/>
-        </w:rPr>
         <w:t xml:space="preserve">Five-fold cross-validation on the 12,818-city training set yields a mean CV R² of </w:t>
       </w:r>
       <w:r>
@@ -12042,7 +12074,7 @@
     </w:p>
     <w:tbl>
       <w:tblPr>
-        <w:tblW w:w="5000" w:type="pct"/>
+        <w:tblW w:w="7200" w:type="dxa"/>
         <w:tblBorders>
           <w:top w:val="single" w:sz="4" w:space="0" w:color="auto"/>
           <w:left w:val="single" w:sz="4" w:space="0" w:color="auto"/>
@@ -12055,16 +12087,16 @@
           <w:left w:w="10" w:type="dxa"/>
           <w:right w:w="10" w:type="dxa"/>
         </w:tblCellMar>
-        <w:tblLook w:val="0000" w:firstRow="0" w:lastRow="0" w:firstColumn="0" w:lastColumn="0" w:noHBand="0" w:noVBand="0"/>
+        <w:tblLook w:val="04A0" w:firstRow="1" w:lastRow="0" w:firstColumn="1" w:lastColumn="0" w:noHBand="0" w:noVBand="1"/>
       </w:tblPr>
       <w:tblGrid>
-        <w:gridCol w:w="4679"/>
-        <w:gridCol w:w="4679"/>
+        <w:gridCol w:w="3600"/>
+        <w:gridCol w:w="3600"/>
       </w:tblGrid>
       <w:tr>
         <w:tc>
           <w:tcPr>
-            <w:tcW w:w="2500" w:type="pct"/>
+            <w:tcW w:w="3600" w:type="dxa"/>
             <w:tcBorders>
               <w:top w:val="single" w:sz="1" w:space="0" w:color="0E7C7B"/>
               <w:left w:val="single" w:sz="1" w:space="0" w:color="0E7C7B"/>
@@ -12102,7 +12134,7 @@
         </w:tc>
         <w:tc>
           <w:tcPr>
-            <w:tcW w:w="2500" w:type="pct"/>
+            <w:tcW w:w="3600" w:type="dxa"/>
             <w:tcBorders>
               <w:top w:val="single" w:sz="1" w:space="0" w:color="0E7C7B"/>
               <w:left w:val="single" w:sz="1" w:space="0" w:color="0E7C7B"/>
@@ -12142,7 +12174,7 @@
       <w:tr>
         <w:tc>
           <w:tcPr>
-            <w:tcW w:w="2500" w:type="pct"/>
+            <w:tcW w:w="3600" w:type="dxa"/>
             <w:tcBorders>
               <w:top w:val="single" w:sz="1" w:space="0" w:color="CCCCCC"/>
               <w:left w:val="single" w:sz="1" w:space="0" w:color="CCCCCC"/>
@@ -12177,7 +12209,7 @@
         </w:tc>
         <w:tc>
           <w:tcPr>
-            <w:tcW w:w="2500" w:type="pct"/>
+            <w:tcW w:w="3600" w:type="dxa"/>
             <w:tcBorders>
               <w:top w:val="single" w:sz="1" w:space="0" w:color="CCCCCC"/>
               <w:left w:val="single" w:sz="1" w:space="0" w:color="CCCCCC"/>
@@ -12214,7 +12246,7 @@
       <w:tr>
         <w:tc>
           <w:tcPr>
-            <w:tcW w:w="2500" w:type="pct"/>
+            <w:tcW w:w="3600" w:type="dxa"/>
             <w:tcBorders>
               <w:top w:val="single" w:sz="1" w:space="0" w:color="CCCCCC"/>
               <w:left w:val="single" w:sz="1" w:space="0" w:color="CCCCCC"/>
@@ -12249,7 +12281,7 @@
         </w:tc>
         <w:tc>
           <w:tcPr>
-            <w:tcW w:w="2500" w:type="pct"/>
+            <w:tcW w:w="3600" w:type="dxa"/>
             <w:tcBorders>
               <w:top w:val="single" w:sz="1" w:space="0" w:color="CCCCCC"/>
               <w:left w:val="single" w:sz="1" w:space="0" w:color="CCCCCC"/>
@@ -12286,7 +12318,7 @@
       <w:tr>
         <w:tc>
           <w:tcPr>
-            <w:tcW w:w="2500" w:type="pct"/>
+            <w:tcW w:w="3600" w:type="dxa"/>
             <w:tcBorders>
               <w:top w:val="single" w:sz="1" w:space="0" w:color="CCCCCC"/>
               <w:left w:val="single" w:sz="1" w:space="0" w:color="CCCCCC"/>
@@ -12321,7 +12353,7 @@
         </w:tc>
         <w:tc>
           <w:tcPr>
-            <w:tcW w:w="2500" w:type="pct"/>
+            <w:tcW w:w="3600" w:type="dxa"/>
             <w:tcBorders>
               <w:top w:val="single" w:sz="1" w:space="0" w:color="CCCCCC"/>
               <w:left w:val="single" w:sz="1" w:space="0" w:color="CCCCCC"/>
@@ -12358,7 +12390,7 @@
       <w:tr>
         <w:tc>
           <w:tcPr>
-            <w:tcW w:w="2500" w:type="pct"/>
+            <w:tcW w:w="3600" w:type="dxa"/>
             <w:tcBorders>
               <w:top w:val="single" w:sz="1" w:space="0" w:color="CCCCCC"/>
               <w:left w:val="single" w:sz="1" w:space="0" w:color="CCCCCC"/>
@@ -12393,7 +12425,7 @@
         </w:tc>
         <w:tc>
           <w:tcPr>
-            <w:tcW w:w="2500" w:type="pct"/>
+            <w:tcW w:w="3600" w:type="dxa"/>
             <w:tcBorders>
               <w:top w:val="single" w:sz="1" w:space="0" w:color="CCCCCC"/>
               <w:left w:val="single" w:sz="1" w:space="0" w:color="CCCCCC"/>
@@ -12430,7 +12462,7 @@
       <w:tr>
         <w:tc>
           <w:tcPr>
-            <w:tcW w:w="2500" w:type="pct"/>
+            <w:tcW w:w="3600" w:type="dxa"/>
             <w:tcBorders>
               <w:top w:val="single" w:sz="1" w:space="0" w:color="CCCCCC"/>
               <w:left w:val="single" w:sz="1" w:space="0" w:color="CCCCCC"/>
@@ -12465,7 +12497,7 @@
         </w:tc>
         <w:tc>
           <w:tcPr>
-            <w:tcW w:w="2500" w:type="pct"/>
+            <w:tcW w:w="3600" w:type="dxa"/>
             <w:tcBorders>
               <w:top w:val="single" w:sz="1" w:space="0" w:color="CCCCCC"/>
               <w:left w:val="single" w:sz="1" w:space="0" w:color="CCCCCC"/>
@@ -12502,7 +12534,7 @@
       <w:tr>
         <w:tc>
           <w:tcPr>
-            <w:tcW w:w="2500" w:type="pct"/>
+            <w:tcW w:w="3600" w:type="dxa"/>
             <w:tcBorders>
               <w:top w:val="single" w:sz="1" w:space="0" w:color="CCCCCC"/>
               <w:left w:val="single" w:sz="1" w:space="0" w:color="CCCCCC"/>
@@ -12537,7 +12569,7 @@
         </w:tc>
         <w:tc>
           <w:tcPr>
-            <w:tcW w:w="2500" w:type="pct"/>
+            <w:tcW w:w="3600" w:type="dxa"/>
             <w:tcBorders>
               <w:top w:val="single" w:sz="1" w:space="0" w:color="CCCCCC"/>
               <w:left w:val="single" w:sz="1" w:space="0" w:color="CCCCCC"/>
@@ -12604,7 +12636,7 @@
           <w:color w:val="0D2B4E"/>
           <w:lang w:val="en-GB"/>
         </w:rPr>
-        <w:t>External Validation</w:t>
+        <w:t>5.2 External Validation</w:t>
       </w:r>
     </w:p>
     <w:p>
@@ -12731,7 +12763,7 @@
           <w:color w:val="0D2B4E"/>
           <w:lang w:val="en-GB"/>
         </w:rPr>
-        <w:t>Limitations of the Validation Framework</w:t>
+        <w:t>5.3 Limitations of the Validation Framework</w:t>
       </w:r>
     </w:p>
     <w:p>
@@ -12753,14 +12785,16 @@
     </w:p>
     <w:p>
       <w:pPr>
-        <w:pBdr>
-          <w:bottom w:val="single" w:sz="4" w:space="1" w:color="CBD5E1"/>
-        </w:pBdr>
-        <w:spacing w:before="200" w:after="200"/>
         <w:rPr>
           <w:lang w:val="en-GB"/>
         </w:rPr>
       </w:pPr>
+      <w:r>
+        <w:rPr>
+          <w:lang w:val="en-GB"/>
+        </w:rPr>
+        <w:br w:type="page"/>
+      </w:r>
     </w:p>
     <w:p>
       <w:pPr>
@@ -12774,7 +12808,8 @@
         <w:rPr>
           <w:lang w:val="en-GB"/>
         </w:rPr>
-        <w:t>Strengths and Limitations</w:t>
+        <w:lastRenderedPageBreak/>
+        <w:t>6. Strengths and Limitations</w:t>
       </w:r>
     </w:p>
     <w:p>
@@ -12789,7 +12824,7 @@
           <w:color w:val="0D2B4E"/>
           <w:lang w:val="en-GB"/>
         </w:rPr>
-        <w:t>Strengths</w:t>
+        <w:t>6.1 Strengths</w:t>
       </w:r>
     </w:p>
     <w:p>
@@ -12929,7 +12964,7 @@
           <w:color w:val="0D2B4E"/>
           <w:lang w:val="en-GB"/>
         </w:rPr>
-        <w:t>Limitations and Mitigations</w:t>
+        <w:t>6.2 Limitations and Mitigations</w:t>
       </w:r>
     </w:p>
     <w:p>
@@ -12979,15 +13014,7 @@
           <w:color w:val="1E293B"/>
           <w:lang w:val="en-GB"/>
         </w:rPr>
-        <w:t xml:space="preserve">Bright urban centres emit light that spills into surrounding peri-urban and rural areas (overglow), artificially inflating measured NTL in areas that are not economically active. The use of GHS-UCDB polygon masking — which restricts city-level aggregation to areas </w:t>
-      </w:r>
-      <w:r>
-        <w:rPr>
-          <w:color w:val="1E293B"/>
-          <w:lang w:val="en-GB"/>
-        </w:rPr>
-        <w:lastRenderedPageBreak/>
-        <w:t>within defined urban boundaries — partially mitigates this by excluding the overglow halo from the city's NTL statistics.</w:t>
+        <w:t>Bright urban centres emit light that spills into surrounding peri-urban and rural areas (overglow), artificially inflating measured NTL in areas that are not economically active. The use of GHS-UCDB polygon masking — which restricts city-level aggregation to areas within defined urban boundaries — partially mitigates this by excluding the overglow halo from the city's NTL statistics.</w:t>
       </w:r>
     </w:p>
     <w:p>
@@ -13055,6 +13082,7 @@
           <w:color w:val="1E293B"/>
           <w:lang w:val="en-GB"/>
         </w:rPr>
+        <w:lastRenderedPageBreak/>
         <w:t xml:space="preserve">98% cap artefact. </w:t>
       </w:r>
       <w:r>
@@ -13091,7 +13119,7 @@
           <w:lang w:val="en-GB"/>
         </w:rPr>
         <w:lastRenderedPageBreak/>
-        <w:t>Policy Implications for UN-Habitat</w:t>
+        <w:t>7. Policy Implications for UN-Habitat</w:t>
       </w:r>
     </w:p>
     <w:p>
@@ -13122,7 +13150,7 @@
           <w:color w:val="0D2B4E"/>
           <w:lang w:val="en-GB"/>
         </w:rPr>
-        <w:t>SDG 11.a.1: Supporting National Urban Policy Evidence Bases</w:t>
+        <w:t>7.1 SDG 11.a.1: Supporting National Urban Policy Evidence Bases</w:t>
       </w:r>
     </w:p>
     <w:p>
@@ -13201,7 +13229,7 @@
           <w:color w:val="0D2B4E"/>
           <w:lang w:val="en-GB"/>
         </w:rPr>
-        <w:t>Disaster Risk Finance and Parametric Insurance</w:t>
+        <w:t>7.2 Disaster Risk Finance and Parametric Insurance</w:t>
       </w:r>
     </w:p>
     <w:p>
@@ -13232,7 +13260,7 @@
           <w:color w:val="0D2B4E"/>
           <w:lang w:val="en-GB"/>
         </w:rPr>
-        <w:t xml:space="preserve"> Cross-Country Benchmarking for African Cities</w:t>
+        <w:t>7.3 Cross-Country Benchmarking for African Cities</w:t>
       </w:r>
     </w:p>
     <w:p>
@@ -13264,7 +13292,7 @@
           <w:color w:val="0D2B4E"/>
           <w:lang w:val="en-GB"/>
         </w:rPr>
-        <w:t>Annual Tracking of Economic Shocks</w:t>
+        <w:t>7.4 Annual Tracking of Economic Shocks</w:t>
       </w:r>
     </w:p>
     <w:p>
@@ -13285,14 +13313,16 @@
     </w:p>
     <w:p>
       <w:pPr>
-        <w:pBdr>
-          <w:bottom w:val="single" w:sz="4" w:space="1" w:color="CBD5E1"/>
-        </w:pBdr>
-        <w:spacing w:before="200" w:after="200"/>
         <w:rPr>
           <w:lang w:val="en-GB"/>
         </w:rPr>
       </w:pPr>
+      <w:r>
+        <w:rPr>
+          <w:lang w:val="en-GB"/>
+        </w:rPr>
+        <w:br w:type="page"/>
+      </w:r>
     </w:p>
     <w:p>
       <w:pPr>
@@ -13306,7 +13336,8 @@
         <w:rPr>
           <w:lang w:val="en-GB"/>
         </w:rPr>
-        <w:t>Reproducibility and Data Access</w:t>
+        <w:lastRenderedPageBreak/>
+        <w:t>8. Reproducibility and Data Access</w:t>
       </w:r>
     </w:p>
     <w:p>
@@ -13467,7 +13498,7 @@
           <w:color w:val="1E293B"/>
           <w:lang w:val="en-GB"/>
         </w:rPr>
-        <w:t>github.com/[your-repo]/urban-gdp-ntl — includes README with step-by-step installation and execution instructions.</w:t>
+        <w:t>github.com/Gkogutu478/urban-gdp-ntl — includes README with step-by-step installation and execution instructions.</w:t>
       </w:r>
     </w:p>
     <w:p>
@@ -13576,21 +13607,14 @@
     </w:p>
     <w:p>
       <w:pPr>
-        <w:rPr>
-          <w:b/>
-          <w:bCs/>
-          <w:color w:val="0D2B4E"/>
-          <w:sz w:val="32"/>
-          <w:szCs w:val="32"/>
+        <w:pBdr>
+          <w:bottom w:val="single" w:sz="4" w:space="1" w:color="CBD5E1"/>
+        </w:pBdr>
+        <w:spacing w:before="200" w:after="200"/>
+        <w:rPr>
           <w:lang w:val="en-GB"/>
         </w:rPr>
       </w:pPr>
-      <w:r>
-        <w:rPr>
-          <w:lang w:val="en-GB"/>
-        </w:rPr>
-        <w:br w:type="page"/>
-      </w:r>
     </w:p>
     <w:p>
       <w:pPr>
@@ -13604,8 +13628,7 @@
         <w:rPr>
           <w:lang w:val="en-GB"/>
         </w:rPr>
-        <w:lastRenderedPageBreak/>
-        <w:t>Conclusion and Next Steps</w:t>
+        <w:t>9. Conclusion and Next Steps</w:t>
       </w:r>
     </w:p>
     <w:p>
@@ -13704,6 +13727,7 @@
           <w:color w:val="1E293B"/>
           <w:lang w:val="en-GB"/>
         </w:rPr>
+        <w:lastRenderedPageBreak/>
         <w:t xml:space="preserve">Integration with poverty and inequality maps: </w:t>
       </w:r>
       <w:r>
@@ -13769,7 +13793,7 @@
           <w:lang w:val="en-GB"/>
         </w:rPr>
         <w:lastRenderedPageBreak/>
-        <w:t>References</w:t>
+        <w:t>10. References</w:t>
       </w:r>
     </w:p>
     <w:p>
@@ -13950,6 +13974,33 @@
           <w:lang w:val="en-GB"/>
         </w:rPr>
         <w:t>9. Zhang, G., Li, X., Su, Y., et al. (2024). A global annual simulated VIIRS nighttime light dataset from 1992 to 2023. Scientific Data, 11, 1384. doi:10.1038/s41597-024-04228-6</w:t>
+      </w:r>
+    </w:p>
+    <w:p>
+      <w:pPr>
+        <w:spacing w:after="120"/>
+        <w:ind w:left="720" w:hanging="720"/>
+        <w:rPr>
+          <w:lang w:val="pt-PT"/>
+        </w:rPr>
+      </w:pPr>
+      <w:r>
+        <w:rPr>
+          <w:color w:val="1E293B"/>
+          <w:sz w:val="20"/>
+          <w:szCs w:val="20"/>
+          <w:lang w:val="en-GB"/>
+        </w:rPr>
+        <w:t xml:space="preserve">10. Ogutu, G. (2026). urban-gdp-ntl: Estimating the Contribution of Cities to National GDP Using Nighttime Lights (v1.0.1) [Software]. </w:t>
+      </w:r>
+      <w:r>
+        <w:rPr>
+          <w:color w:val="1E293B"/>
+          <w:sz w:val="20"/>
+          <w:szCs w:val="20"/>
+          <w:lang w:val="pt-PT"/>
+        </w:rPr>
+        <w:t>Zenodo. https://doi.org/10.5281/zenodo.20579691. Repository: https://github.com/Gkogutu478/urban-gdp-ntl</w:t>
       </w:r>
     </w:p>
     <w:p>
@@ -13959,7 +14010,7 @@
         </w:pBdr>
         <w:spacing w:before="200" w:after="200"/>
         <w:rPr>
-          <w:lang w:val="en-GB"/>
+          <w:lang w:val="pt-PT"/>
         </w:rPr>
       </w:pPr>
     </w:p>
@@ -13993,7 +14044,7 @@
           <w:left w:w="10" w:type="dxa"/>
           <w:right w:w="10" w:type="dxa"/>
         </w:tblCellMar>
-        <w:tblLook w:val="0000" w:firstRow="0" w:lastRow="0" w:firstColumn="0" w:lastColumn="0" w:noHBand="0" w:noVBand="0"/>
+        <w:tblLook w:val="04A0" w:firstRow="1" w:lastRow="0" w:firstColumn="1" w:lastColumn="0" w:noHBand="0" w:noVBand="1"/>
       </w:tblPr>
       <w:tblGrid>
         <w:gridCol w:w="1800"/>
@@ -15218,6 +15269,7 @@
                 <w:szCs w:val="19"/>
                 <w:lang w:val="en-GB"/>
               </w:rPr>
+              <w:lastRenderedPageBreak/>
               <w:t>area_km2</w:t>
             </w:r>
           </w:p>
@@ -15432,7 +15484,6 @@
                 <w:szCs w:val="19"/>
                 <w:lang w:val="en-GB"/>
               </w:rPr>
-              <w:lastRenderedPageBreak/>
               <w:t>built_share</w:t>
             </w:r>
           </w:p>
@@ -16306,7 +16357,7 @@
           <w:color w:val="1E293B"/>
           <w:lang w:val="en-GB"/>
         </w:rPr>
-        <w:t>The full country-level urban GDP share table (170 countries) is available in the file TABLE1_country_urban_gdp_shares.csv in the analysis repository. The file includes columns for country ISO3 code, country name, world region, number of cities modelled, national GDP (2020, bn USD), urban GDP share (%), estimated urban GDP (bn USD), primary city name and GDP share, and secondary city name and GDP share.</w:t>
+        <w:t>The full country-level urban GDP share table (170 countries) is available in the file TABLE1_country_urban_gdp_shares.csv in the analysis repository at https://github.com/Gkogutu478/urban-gdp-ntl (DOI: https://doi.org/10.5281/zenodo.20579691). The file includes columns for country ISO3 code, country name, world region, number of cities modelled, national GDP (2020, bn USD), urban GDP share (%), estimated urban GDP (bn USD), primary city name and GDP share, and secondary city name and GDP share.</w:t>
       </w:r>
     </w:p>
     <w:p>
@@ -16339,7 +16390,7 @@
           <w:left w:w="10" w:type="dxa"/>
           <w:right w:w="10" w:type="dxa"/>
         </w:tblCellMar>
-        <w:tblLook w:val="0000" w:firstRow="0" w:lastRow="0" w:firstColumn="0" w:lastColumn="0" w:noHBand="0" w:noVBand="0"/>
+        <w:tblLook w:val="04A0" w:firstRow="1" w:lastRow="0" w:firstColumn="1" w:lastColumn="0" w:noHBand="0" w:noVBand="1"/>
       </w:tblPr>
       <w:tblGrid>
         <w:gridCol w:w="3000"/>
@@ -17165,8 +17216,8 @@
       </w:r>
     </w:p>
     <w:sectPr>
-      <w:headerReference w:type="default" r:id="rId8"/>
-      <w:footerReference w:type="default" r:id="rId9"/>
+      <w:headerReference w:type="default" r:id="rId7"/>
+      <w:footerReference w:type="default" r:id="rId8"/>
       <w:pgSz w:w="12240" w:h="15840"/>
       <w:pgMar w:top="1440" w:right="1440" w:bottom="1440" w:left="1440" w:header="708" w:footer="708" w:gutter="0"/>
       <w:cols w:space="720"/>
@@ -17273,23 +17324,7 @@
         <w:sz w:val="18"/>
         <w:szCs w:val="18"/>
       </w:rPr>
-      <w:t xml:space="preserve">Estimating the Contribution of Cities to National GDP: A Nighttime Lights </w:t>
-    </w:r>
-    <w:r>
-      <w:rPr>
-        <w:color w:val="475569"/>
-        <w:sz w:val="18"/>
-        <w:szCs w:val="18"/>
-      </w:rPr>
-      <w:t>Approach |</w:t>
-    </w:r>
-    <w:r>
-      <w:rPr>
-        <w:color w:val="475569"/>
-        <w:sz w:val="18"/>
-        <w:szCs w:val="18"/>
-      </w:rPr>
-      <w:t xml:space="preserve">  UN-Habitat Working Paper | June 2026</w:t>
+      <w:t>Estimating the Contribution of Cities to National GDP: A Nighttime Lights Approach  |  UN-Habitat Working Paper | June 2026</w:t>
     </w:r>
   </w:p>
 </w:hdr>
@@ -17298,99 +17333,10 @@
 <file path=word/numbering.xml><?xml version="1.0" encoding="utf-8"?>
 <w:numbering xmlns:wpc="http://schemas.microsoft.com/office/word/2010/wordprocessingCanvas" xmlns:cx="http://schemas.microsoft.com/office/drawing/2014/chartex" xmlns:cx1="http://schemas.microsoft.com/office/drawing/2015/9/8/chartex" xmlns:cx2="http://schemas.microsoft.com/office/drawing/2015/10/21/chartex" xmlns:cx3="http://schemas.microsoft.com/office/drawing/2016/5/9/chartex" xmlns:cx4="http://schemas.microsoft.com/office/drawing/2016/5/10/chartex" xmlns:cx5="http://schemas.microsoft.com/office/drawing/2016/5/11/chartex" xmlns:cx6="http://schemas.microsoft.com/office/drawing/2016/5/12/chartex" xmlns:cx7="http://schemas.microsoft.com/office/drawing/2016/5/13/chartex" xmlns:cx8="http://schemas.microsoft.com/office/drawing/2016/5/14/chartex" xmlns:mc="http://schemas.openxmlformats.org/markup-compatibility/2006" xmlns:aink="http://schemas.microsoft.com/office/drawing/2016/ink" xmlns:am3d="http://schemas.microsoft.com/office/drawing/2017/model3d" xmlns:o="urn:schemas-microsoft-com:office:office" xmlns:oel="http://schemas.microsoft.com/office/2019/extlst" xmlns:r="http://schemas.openxmlformats.org/officeDocument/2006/relationships" xmlns:m="http://schemas.openxmlformats.org/officeDocument/2006/math" xmlns:v="urn:schemas-microsoft-com:vml" xmlns:wp14="http://schemas.microsoft.com/office/word/2010/wordprocessingDrawing" xmlns:wp="http://schemas.openxmlformats.org/drawingml/2006/wordprocessingDrawing" xmlns:w10="urn:schemas-microsoft-com:office:word" xmlns:w="http://schemas.openxmlformats.org/wordprocessingml/2006/main" xmlns:w14="http://schemas.microsoft.com/office/word/2010/wordml" xmlns:w15="http://schemas.microsoft.com/office/word/2012/wordml" xmlns:w16cex="http://schemas.microsoft.com/office/word/2018/wordml/cex" xmlns:w16cid="http://schemas.microsoft.com/office/word/2016/wordml/cid" xmlns:w16="http://schemas.microsoft.com/office/word/2018/wordml" xmlns:w16du="http://schemas.microsoft.com/office/word/2023/wordml/word16du" xmlns:w16sdtdh="http://schemas.microsoft.com/office/word/2020/wordml/sdtdatahash" xmlns:w16sdtfl="http://schemas.microsoft.com/office/word/2024/wordml/sdtformatlock" xmlns:w16se="http://schemas.microsoft.com/office/word/2015/wordml/symex" xmlns:wpg="http://schemas.microsoft.com/office/word/2010/wordprocessingGroup" xmlns:wpi="http://schemas.microsoft.com/office/word/2010/wordprocessingInk" xmlns:wne="http://schemas.microsoft.com/office/word/2006/wordml" xmlns:wps="http://schemas.microsoft.com/office/word/2010/wordprocessingShape" mc:Ignorable="w14 w15 w16se w16cid w16 w16cex w16sdtdh w16sdtfl w16du wp14">
   <w:abstractNum w:abstractNumId="0" w15:restartNumberingAfterBreak="0">
-    <w:nsid w:val="07B43687"/>
+    <w:nsid w:val="441E051E"/>
     <w:multiLevelType w:val="hybridMultilevel"/>
-    <w:tmpl w:val="EBD4AC88"/>
-    <w:lvl w:ilvl="0" w:tplc="0409000F">
-      <w:start w:val="1"/>
-      <w:numFmt w:val="decimal"/>
-      <w:lvlText w:val="%1."/>
-      <w:lvlJc w:val="left"/>
-      <w:pPr>
-        <w:ind w:left="720" w:hanging="360"/>
-      </w:pPr>
-      <w:rPr>
-        <w:rFonts w:hint="default"/>
-      </w:rPr>
-    </w:lvl>
-    <w:lvl w:ilvl="1" w:tplc="04090019" w:tentative="1">
-      <w:start w:val="1"/>
-      <w:numFmt w:val="lowerLetter"/>
-      <w:lvlText w:val="%2."/>
-      <w:lvlJc w:val="left"/>
-      <w:pPr>
-        <w:ind w:left="1440" w:hanging="360"/>
-      </w:pPr>
-    </w:lvl>
-    <w:lvl w:ilvl="2" w:tplc="0409001B" w:tentative="1">
-      <w:start w:val="1"/>
-      <w:numFmt w:val="lowerRoman"/>
-      <w:lvlText w:val="%3."/>
-      <w:lvlJc w:val="right"/>
-      <w:pPr>
-        <w:ind w:left="2160" w:hanging="180"/>
-      </w:pPr>
-    </w:lvl>
-    <w:lvl w:ilvl="3" w:tplc="0409000F" w:tentative="1">
-      <w:start w:val="1"/>
-      <w:numFmt w:val="decimal"/>
-      <w:lvlText w:val="%4."/>
-      <w:lvlJc w:val="left"/>
-      <w:pPr>
-        <w:ind w:left="2880" w:hanging="360"/>
-      </w:pPr>
-    </w:lvl>
-    <w:lvl w:ilvl="4" w:tplc="04090019" w:tentative="1">
-      <w:start w:val="1"/>
-      <w:numFmt w:val="lowerLetter"/>
-      <w:lvlText w:val="%5."/>
-      <w:lvlJc w:val="left"/>
-      <w:pPr>
-        <w:ind w:left="3600" w:hanging="360"/>
-      </w:pPr>
-    </w:lvl>
-    <w:lvl w:ilvl="5" w:tplc="0409001B" w:tentative="1">
-      <w:start w:val="1"/>
-      <w:numFmt w:val="lowerRoman"/>
-      <w:lvlText w:val="%6."/>
-      <w:lvlJc w:val="right"/>
-      <w:pPr>
-        <w:ind w:left="4320" w:hanging="180"/>
-      </w:pPr>
-    </w:lvl>
-    <w:lvl w:ilvl="6" w:tplc="0409000F" w:tentative="1">
-      <w:start w:val="1"/>
-      <w:numFmt w:val="decimal"/>
-      <w:lvlText w:val="%7."/>
-      <w:lvlJc w:val="left"/>
-      <w:pPr>
-        <w:ind w:left="5040" w:hanging="360"/>
-      </w:pPr>
-    </w:lvl>
-    <w:lvl w:ilvl="7" w:tplc="04090019" w:tentative="1">
-      <w:start w:val="1"/>
-      <w:numFmt w:val="lowerLetter"/>
-      <w:lvlText w:val="%8."/>
-      <w:lvlJc w:val="left"/>
-      <w:pPr>
-        <w:ind w:left="5760" w:hanging="360"/>
-      </w:pPr>
-    </w:lvl>
-    <w:lvl w:ilvl="8" w:tplc="0409001B" w:tentative="1">
-      <w:start w:val="1"/>
-      <w:numFmt w:val="lowerRoman"/>
-      <w:lvlText w:val="%9."/>
-      <w:lvlJc w:val="right"/>
-      <w:pPr>
-        <w:ind w:left="6480" w:hanging="180"/>
-      </w:pPr>
-    </w:lvl>
-  </w:abstractNum>
-  <w:abstractNum w:abstractNumId="1" w15:restartNumberingAfterBreak="0">
-    <w:nsid w:val="37A746A5"/>
-    <w:multiLevelType w:val="hybridMultilevel"/>
-    <w:tmpl w:val="37FACE32"/>
-    <w:lvl w:ilvl="0" w:tplc="DB34F11C">
+    <w:tmpl w:val="0C9CF8B2"/>
+    <w:lvl w:ilvl="0" w:tplc="62E2EEBA">
       <w:start w:val="1"/>
       <w:numFmt w:val="bullet"/>
       <w:lvlText w:val="●"/>
@@ -17399,7 +17345,7 @@
         <w:ind w:left="720" w:hanging="360"/>
       </w:pPr>
     </w:lvl>
-    <w:lvl w:ilvl="1" w:tplc="5E1CF098">
+    <w:lvl w:ilvl="1" w:tplc="1772F12C">
       <w:start w:val="1"/>
       <w:numFmt w:val="bullet"/>
       <w:lvlText w:val="○"/>
@@ -17408,7 +17354,7 @@
         <w:ind w:left="1440" w:hanging="360"/>
       </w:pPr>
     </w:lvl>
-    <w:lvl w:ilvl="2" w:tplc="8EC23FFE">
+    <w:lvl w:ilvl="2" w:tplc="BD084F3E">
       <w:start w:val="1"/>
       <w:numFmt w:val="bullet"/>
       <w:lvlText w:val="■"/>
@@ -17417,7 +17363,7 @@
         <w:ind w:left="2160" w:hanging="360"/>
       </w:pPr>
     </w:lvl>
-    <w:lvl w:ilvl="3" w:tplc="70FCD516">
+    <w:lvl w:ilvl="3" w:tplc="84C2846A">
       <w:start w:val="1"/>
       <w:numFmt w:val="bullet"/>
       <w:lvlText w:val="●"/>
@@ -17426,7 +17372,7 @@
         <w:ind w:left="2880" w:hanging="360"/>
       </w:pPr>
     </w:lvl>
-    <w:lvl w:ilvl="4" w:tplc="6C3A5C3E">
+    <w:lvl w:ilvl="4" w:tplc="3F46F24A">
       <w:start w:val="1"/>
       <w:numFmt w:val="bullet"/>
       <w:lvlText w:val="○"/>
@@ -17435,7 +17381,7 @@
         <w:ind w:left="3600" w:hanging="360"/>
       </w:pPr>
     </w:lvl>
-    <w:lvl w:ilvl="5" w:tplc="50FC2CE4">
+    <w:lvl w:ilvl="5" w:tplc="9E165984">
       <w:start w:val="1"/>
       <w:numFmt w:val="bullet"/>
       <w:lvlText w:val="■"/>
@@ -17444,7 +17390,7 @@
         <w:ind w:left="4320" w:hanging="360"/>
       </w:pPr>
     </w:lvl>
-    <w:lvl w:ilvl="6" w:tplc="9B00F84A">
+    <w:lvl w:ilvl="6" w:tplc="8ACE78D0">
       <w:start w:val="1"/>
       <w:numFmt w:val="bullet"/>
       <w:lvlText w:val="●"/>
@@ -17453,7 +17399,7 @@
         <w:ind w:left="5040" w:hanging="360"/>
       </w:pPr>
     </w:lvl>
-    <w:lvl w:ilvl="7" w:tplc="F3F6BFD8">
+    <w:lvl w:ilvl="7" w:tplc="241EE130">
       <w:start w:val="1"/>
       <w:numFmt w:val="bullet"/>
       <w:lvlText w:val="●"/>
@@ -17462,7 +17408,7 @@
         <w:ind w:left="5760" w:hanging="360"/>
       </w:pPr>
     </w:lvl>
-    <w:lvl w:ilvl="8" w:tplc="6BFE7078">
+    <w:lvl w:ilvl="8" w:tplc="6870327C">
       <w:start w:val="1"/>
       <w:numFmt w:val="bullet"/>
       <w:lvlText w:val="●"/>
@@ -17472,11 +17418,11 @@
       </w:pPr>
     </w:lvl>
   </w:abstractNum>
-  <w:abstractNum w:abstractNumId="2" w15:restartNumberingAfterBreak="0">
-    <w:nsid w:val="69BA5193"/>
+  <w:abstractNum w:abstractNumId="1" w15:restartNumberingAfterBreak="0">
+    <w:nsid w:val="69E5366E"/>
     <w:multiLevelType w:val="hybridMultilevel"/>
-    <w:tmpl w:val="8A9C1B7E"/>
-    <w:lvl w:ilvl="0" w:tplc="390281BC">
+    <w:tmpl w:val="AEFCA952"/>
+    <w:lvl w:ilvl="0" w:tplc="3C5AB7E4">
       <w:start w:val="1"/>
       <w:numFmt w:val="bullet"/>
       <w:lvlText w:val="•"/>
@@ -17485,61 +17431,58 @@
         <w:ind w:left="720" w:hanging="360"/>
       </w:pPr>
     </w:lvl>
-    <w:lvl w:ilvl="1" w:tplc="6A781B82">
+    <w:lvl w:ilvl="1" w:tplc="36E8BE28">
       <w:numFmt w:val="decimal"/>
       <w:lvlText w:val=""/>
       <w:lvlJc w:val="left"/>
     </w:lvl>
-    <w:lvl w:ilvl="2" w:tplc="AF886F90">
+    <w:lvl w:ilvl="2" w:tplc="BAF2488C">
       <w:numFmt w:val="decimal"/>
       <w:lvlText w:val=""/>
       <w:lvlJc w:val="left"/>
     </w:lvl>
-    <w:lvl w:ilvl="3" w:tplc="71787A1A">
+    <w:lvl w:ilvl="3" w:tplc="760ADC60">
       <w:numFmt w:val="decimal"/>
       <w:lvlText w:val=""/>
       <w:lvlJc w:val="left"/>
     </w:lvl>
-    <w:lvl w:ilvl="4" w:tplc="97309598">
+    <w:lvl w:ilvl="4" w:tplc="F424B6AC">
       <w:numFmt w:val="decimal"/>
       <w:lvlText w:val=""/>
       <w:lvlJc w:val="left"/>
     </w:lvl>
-    <w:lvl w:ilvl="5" w:tplc="79901608">
+    <w:lvl w:ilvl="5" w:tplc="6FEC3AD8">
       <w:numFmt w:val="decimal"/>
       <w:lvlText w:val=""/>
       <w:lvlJc w:val="left"/>
     </w:lvl>
-    <w:lvl w:ilvl="6" w:tplc="8E84DFEC">
+    <w:lvl w:ilvl="6" w:tplc="DA709F84">
       <w:numFmt w:val="decimal"/>
       <w:lvlText w:val=""/>
       <w:lvlJc w:val="left"/>
     </w:lvl>
-    <w:lvl w:ilvl="7" w:tplc="E736C1F8">
+    <w:lvl w:ilvl="7" w:tplc="0CEE760C">
       <w:numFmt w:val="decimal"/>
       <w:lvlText w:val=""/>
       <w:lvlJc w:val="left"/>
     </w:lvl>
-    <w:lvl w:ilvl="8" w:tplc="025CBFCC">
+    <w:lvl w:ilvl="8" w:tplc="2996A66A">
       <w:numFmt w:val="decimal"/>
       <w:lvlText w:val=""/>
       <w:lvlJc w:val="left"/>
     </w:lvl>
   </w:abstractNum>
-  <w:num w:numId="1" w16cid:durableId="1346634878">
+  <w:num w:numId="1" w16cid:durableId="875047371">
+    <w:abstractNumId w:val="0"/>
+    <w:lvlOverride w:ilvl="0">
+      <w:startOverride w:val="1"/>
+    </w:lvlOverride>
+  </w:num>
+  <w:num w:numId="2" w16cid:durableId="2071268402">
     <w:abstractNumId w:val="1"/>
     <w:lvlOverride w:ilvl="0">
       <w:startOverride w:val="1"/>
     </w:lvlOverride>
-  </w:num>
-  <w:num w:numId="2" w16cid:durableId="1181697087">
-    <w:abstractNumId w:val="2"/>
-    <w:lvlOverride w:ilvl="0">
-      <w:startOverride w:val="1"/>
-    </w:lvlOverride>
-  </w:num>
-  <w:num w:numId="3" w16cid:durableId="313412422">
-    <w:abstractNumId w:val="0"/>
   </w:num>
 </w:numbering>
 </file>
@@ -18154,7 +18097,7 @@
     <w:link w:val="HeaderChar"/>
     <w:uiPriority w:val="99"/>
     <w:unhideWhenUsed/>
-    <w:rsid w:val="000F4B25"/>
+    <w:rsid w:val="008E2B3C"/>
     <w:pPr>
       <w:tabs>
         <w:tab w:val="center" w:pos="4680"/>
@@ -18167,7 +18110,7 @@
     <w:basedOn w:val="DefaultParagraphFont"/>
     <w:link w:val="Header"/>
     <w:uiPriority w:val="99"/>
-    <w:rsid w:val="000F4B25"/>
+    <w:rsid w:val="008E2B3C"/>
   </w:style>
   <w:style w:type="paragraph" w:styleId="Footer">
     <w:name w:val="footer"/>
@@ -18175,7 +18118,7 @@
     <w:link w:val="FooterChar"/>
     <w:uiPriority w:val="99"/>
     <w:unhideWhenUsed/>
-    <w:rsid w:val="000F4B25"/>
+    <w:rsid w:val="008E2B3C"/>
     <w:pPr>
       <w:tabs>
         <w:tab w:val="center" w:pos="4680"/>
@@ -18188,7 +18131,7 @@
     <w:basedOn w:val="DefaultParagraphFont"/>
     <w:link w:val="Footer"/>
     <w:uiPriority w:val="99"/>
-    <w:rsid w:val="000F4B25"/>
+    <w:rsid w:val="008E2B3C"/>
   </w:style>
 </w:styles>
 </file>
@@ -18510,6 +18453,6 @@
 
 <file path=docMetadata/LabelInfo.xml><?xml version="1.0" encoding="utf-8"?>
 <clbl:labelList xmlns:clbl="http://schemas.microsoft.com/office/2020/mipLabelMetadata">
-  <clbl:label id="{7eb58d0f-f804-411f-a20e-09ebfae62b4c}" enabled="1" method="Privileged" siteId="{0f9e35db-544f-4f60-bdcc-5ea416e6dc70}" contentBits="0" removed="0"/>
+  <clbl:label id="{8b77875e-5908-45a0-9cb4-dec9ae074618}" enabled="1" method="Privileged" siteId="{0f9e35db-544f-4f60-bdcc-5ea416e6dc70}" contentBits="0" removed="0"/>
 </clbl:labelList>
 </file>
</xml_diff>